<commit_message>
phase-3.1: update self-check report with engineering redlines
</commit_message>
<xml_diff>
--- a/docs/Phase3.1_自检报告.docx
+++ b/docs/Phase3.1_自检报告.docx
@@ -21,7 +21,7 @@
           <w:sz w:val="24"/>
           <w:szCs w:val="24"/>
         </w:rPr>
-        <w:t xml:space="preserve">岗位管理与 JD / 岗位画像体系页面开发</w:t>
+        <w:t xml:space="preserve">岗位管理与 JD / 岗位画像体系 — 含全局工程红线验收</w:t>
       </w:r>
     </w:p>
     <w:p>
@@ -286,13 +286,1839 @@
           </w:p>
         </w:tc>
       </w:tr>
+      <w:tr>
+        <w:tc>
+          <w:tcPr>
+            <w:tcW w:type="dxa" w:w="3000"/>
+            <w:tcBorders>
+              <w:top w:val="single" w:color="CCCCCC" w:sz="1"/>
+              <w:left w:val="single" w:color="CCCCCC" w:sz="1"/>
+              <w:bottom w:val="single" w:color="CCCCCC" w:sz="1"/>
+              <w:right w:val="single" w:color="CCCCCC" w:sz="1"/>
+            </w:tcBorders>
+            <w:tcMar>
+              <w:top w:type="dxa" w:w="60"/>
+              <w:left w:type="dxa" w:w="100"/>
+              <w:bottom w:type="dxa" w:w="60"/>
+              <w:right w:type="dxa" w:w="100"/>
+            </w:tcMar>
+          </w:tcPr>
+          <w:p>
+            <w:r>
+              <w:rPr>
+                <w:rFonts w:ascii="Arial" w:cs="Arial" w:eastAsia="Arial" w:hAnsi="Arial"/>
+                <w:sz w:val="20"/>
+                <w:szCs w:val="20"/>
+              </w:rPr>
+              <w:t xml:space="preserve">HEAD commit</w:t>
+            </w:r>
+          </w:p>
+        </w:tc>
+        <w:tc>
+          <w:tcPr>
+            <w:tcW w:type="dxa" w:w="6026"/>
+            <w:tcBorders>
+              <w:top w:val="single" w:color="CCCCCC" w:sz="1"/>
+              <w:left w:val="single" w:color="CCCCCC" w:sz="1"/>
+              <w:bottom w:val="single" w:color="CCCCCC" w:sz="1"/>
+              <w:right w:val="single" w:color="CCCCCC" w:sz="1"/>
+            </w:tcBorders>
+            <w:tcMar>
+              <w:top w:type="dxa" w:w="60"/>
+              <w:left w:type="dxa" w:w="100"/>
+              <w:bottom w:type="dxa" w:w="60"/>
+              <w:right w:type="dxa" w:w="100"/>
+            </w:tcMar>
+          </w:tcPr>
+          <w:p>
+            <w:r>
+              <w:rPr>
+                <w:rFonts w:ascii="Arial" w:cs="Arial" w:eastAsia="Arial" w:hAnsi="Arial"/>
+                <w:sz w:val="20"/>
+                <w:szCs w:val="20"/>
+              </w:rPr>
+              <w:t xml:space="preserve">3c8e17c</w:t>
+            </w:r>
+          </w:p>
+        </w:tc>
+      </w:tr>
+      <w:tr>
+        <w:tc>
+          <w:tcPr>
+            <w:tcW w:type="dxa" w:w="3000"/>
+            <w:tcBorders>
+              <w:top w:val="single" w:color="CCCCCC" w:sz="1"/>
+              <w:left w:val="single" w:color="CCCCCC" w:sz="1"/>
+              <w:bottom w:val="single" w:color="CCCCCC" w:sz="1"/>
+              <w:right w:val="single" w:color="CCCCCC" w:sz="1"/>
+            </w:tcBorders>
+            <w:tcMar>
+              <w:top w:type="dxa" w:w="60"/>
+              <w:left w:type="dxa" w:w="100"/>
+              <w:bottom w:type="dxa" w:w="60"/>
+              <w:right w:type="dxa" w:w="100"/>
+            </w:tcMar>
+          </w:tcPr>
+          <w:p>
+            <w:r>
+              <w:rPr>
+                <w:rFonts w:ascii="Arial" w:cs="Arial" w:eastAsia="Arial" w:hAnsi="Arial"/>
+                <w:sz w:val="20"/>
+                <w:szCs w:val="20"/>
+              </w:rPr>
+              <w:t xml:space="preserve">tag phase-3.1</w:t>
+            </w:r>
+          </w:p>
+        </w:tc>
+        <w:tc>
+          <w:tcPr>
+            <w:tcW w:type="dxa" w:w="6026"/>
+            <w:tcBorders>
+              <w:top w:val="single" w:color="CCCCCC" w:sz="1"/>
+              <w:left w:val="single" w:color="CCCCCC" w:sz="1"/>
+              <w:bottom w:val="single" w:color="CCCCCC" w:sz="1"/>
+              <w:right w:val="single" w:color="CCCCCC" w:sz="1"/>
+            </w:tcBorders>
+            <w:tcMar>
+              <w:top w:type="dxa" w:w="60"/>
+              <w:left w:type="dxa" w:w="100"/>
+              <w:bottom w:type="dxa" w:w="60"/>
+              <w:right w:type="dxa" w:w="100"/>
+            </w:tcMar>
+          </w:tcPr>
+          <w:p>
+            <w:r>
+              <w:rPr>
+                <w:rFonts w:ascii="Arial" w:cs="Arial" w:eastAsia="Arial" w:hAnsi="Arial"/>
+                <w:sz w:val="20"/>
+                <w:szCs w:val="20"/>
+              </w:rPr>
+              <w:t xml:space="preserve">✅ 已 push</w:t>
+            </w:r>
+          </w:p>
+        </w:tc>
+      </w:tr>
     </w:tbl>
     <w:p>
       <w:pPr>
         <w:pStyle w:val="Heading2"/>
       </w:pPr>
       <w:r>
-        <w:t xml:space="preserve">二、API 清单</w:t>
+        <w:t xml:space="preserve">二、红线一：非前端假页面证明</w:t>
+      </w:r>
+    </w:p>
+    <w:tbl>
+      <w:tblPr>
+        <w:tblW w:type="dxa" w:w="9026"/>
+        <w:tblBorders>
+          <w:top w:val="single" w:color="auto" w:sz="4"/>
+          <w:left w:val="single" w:color="auto" w:sz="4"/>
+          <w:bottom w:val="single" w:color="auto" w:sz="4"/>
+          <w:right w:val="single" w:color="auto" w:sz="4"/>
+          <w:insideH w:val="single" w:color="auto" w:sz="4"/>
+          <w:insideV w:val="single" w:color="auto" w:sz="4"/>
+        </w:tblBorders>
+      </w:tblPr>
+      <w:tblGrid>
+        <w:gridCol w:w="4513"/>
+        <w:gridCol w:w="4513"/>
+      </w:tblGrid>
+      <w:tr>
+        <w:tc>
+          <w:tcPr>
+            <w:tcW w:type="dxa" w:w="4513"/>
+            <w:tcBorders>
+              <w:top w:val="single" w:color="CCCCCC" w:sz="1"/>
+              <w:left w:val="single" w:color="CCCCCC" w:sz="1"/>
+              <w:bottom w:val="single" w:color="CCCCCC" w:sz="1"/>
+              <w:right w:val="single" w:color="CCCCCC" w:sz="1"/>
+            </w:tcBorders>
+            <w:shd w:fill="2563eb" w:val="clear"/>
+            <w:tcMar>
+              <w:top w:type="dxa" w:w="60"/>
+              <w:left w:type="dxa" w:w="100"/>
+              <w:bottom w:type="dxa" w:w="60"/>
+              <w:right w:type="dxa" w:w="100"/>
+            </w:tcMar>
+          </w:tcPr>
+          <w:p>
+            <w:r>
+              <w:rPr>
+                <w:rFonts w:ascii="Arial" w:cs="Arial" w:eastAsia="Arial" w:hAnsi="Arial"/>
+                <w:b/>
+                <w:bCs/>
+                <w:color w:val="FFFFFF"/>
+                <w:sz w:val="20"/>
+                <w:szCs w:val="20"/>
+              </w:rPr>
+              <w:t xml:space="preserve">检查项</w:t>
+            </w:r>
+          </w:p>
+        </w:tc>
+        <w:tc>
+          <w:tcPr>
+            <w:tcW w:type="dxa" w:w="4513"/>
+            <w:tcBorders>
+              <w:top w:val="single" w:color="CCCCCC" w:sz="1"/>
+              <w:left w:val="single" w:color="CCCCCC" w:sz="1"/>
+              <w:bottom w:val="single" w:color="CCCCCC" w:sz="1"/>
+              <w:right w:val="single" w:color="CCCCCC" w:sz="1"/>
+            </w:tcBorders>
+            <w:shd w:fill="2563eb" w:val="clear"/>
+            <w:tcMar>
+              <w:top w:type="dxa" w:w="60"/>
+              <w:left w:type="dxa" w:w="100"/>
+              <w:bottom w:type="dxa" w:w="60"/>
+              <w:right w:type="dxa" w:w="100"/>
+            </w:tcMar>
+          </w:tcPr>
+          <w:p>
+            <w:r>
+              <w:rPr>
+                <w:rFonts w:ascii="Arial" w:cs="Arial" w:eastAsia="Arial" w:hAnsi="Arial"/>
+                <w:b/>
+                <w:bCs/>
+                <w:color w:val="FFFFFF"/>
+                <w:sz w:val="20"/>
+                <w:szCs w:val="20"/>
+              </w:rPr>
+              <w:t xml:space="preserve">结果</w:t>
+            </w:r>
+          </w:p>
+        </w:tc>
+      </w:tr>
+      <w:tr>
+        <w:tc>
+          <w:tcPr>
+            <w:tcW w:type="dxa" w:w="4513"/>
+            <w:tcBorders>
+              <w:top w:val="single" w:color="CCCCCC" w:sz="1"/>
+              <w:left w:val="single" w:color="CCCCCC" w:sz="1"/>
+              <w:bottom w:val="single" w:color="CCCCCC" w:sz="1"/>
+              <w:right w:val="single" w:color="CCCCCC" w:sz="1"/>
+            </w:tcBorders>
+            <w:tcMar>
+              <w:top w:type="dxa" w:w="60"/>
+              <w:left w:type="dxa" w:w="100"/>
+              <w:bottom w:type="dxa" w:w="60"/>
+              <w:right w:type="dxa" w:w="100"/>
+            </w:tcMar>
+          </w:tcPr>
+          <w:p>
+            <w:r>
+              <w:rPr>
+                <w:rFonts w:ascii="Arial" w:cs="Arial" w:eastAsia="Arial" w:hAnsi="Arial"/>
+                <w:sz w:val="20"/>
+                <w:szCs w:val="20"/>
+              </w:rPr>
+              <w:t xml:space="preserve">页面数据来自数据库</w:t>
+            </w:r>
+          </w:p>
+        </w:tc>
+        <w:tc>
+          <w:tcPr>
+            <w:tcW w:type="dxa" w:w="4513"/>
+            <w:tcBorders>
+              <w:top w:val="single" w:color="CCCCCC" w:sz="1"/>
+              <w:left w:val="single" w:color="CCCCCC" w:sz="1"/>
+              <w:bottom w:val="single" w:color="CCCCCC" w:sz="1"/>
+              <w:right w:val="single" w:color="CCCCCC" w:sz="1"/>
+            </w:tcBorders>
+            <w:tcMar>
+              <w:top w:type="dxa" w:w="60"/>
+              <w:left w:type="dxa" w:w="100"/>
+              <w:bottom w:type="dxa" w:w="60"/>
+              <w:right w:type="dxa" w:w="100"/>
+            </w:tcMar>
+          </w:tcPr>
+          <w:p>
+            <w:r>
+              <w:rPr>
+                <w:rFonts w:ascii="Arial" w:cs="Arial" w:eastAsia="Arial" w:hAnsi="Arial"/>
+                <w:b/>
+                <w:bCs/>
+                <w:color w:val="16a34a"/>
+                <w:sz w:val="20"/>
+                <w:szCs w:val="20"/>
+              </w:rPr>
+              <w:t xml:space="preserve">✅ PASS</w:t>
+            </w:r>
+          </w:p>
+        </w:tc>
+      </w:tr>
+      <w:tr>
+        <w:tc>
+          <w:tcPr>
+            <w:tcW w:type="dxa" w:w="4513"/>
+            <w:tcBorders>
+              <w:top w:val="single" w:color="CCCCCC" w:sz="1"/>
+              <w:left w:val="single" w:color="CCCCCC" w:sz="1"/>
+              <w:bottom w:val="single" w:color="CCCCCC" w:sz="1"/>
+              <w:right w:val="single" w:color="CCCCCC" w:sz="1"/>
+            </w:tcBorders>
+            <w:tcMar>
+              <w:top w:type="dxa" w:w="60"/>
+              <w:left w:type="dxa" w:w="100"/>
+              <w:bottom w:type="dxa" w:w="60"/>
+              <w:right w:type="dxa" w:w="100"/>
+            </w:tcMar>
+          </w:tcPr>
+          <w:p>
+            <w:r>
+              <w:rPr>
+                <w:rFonts w:ascii="Arial" w:cs="Arial" w:eastAsia="Arial" w:hAnsi="Arial"/>
+                <w:sz w:val="20"/>
+                <w:szCs w:val="20"/>
+              </w:rPr>
+              <w:t xml:space="preserve">KPI 来自服务端聚合</w:t>
+            </w:r>
+          </w:p>
+        </w:tc>
+        <w:tc>
+          <w:tcPr>
+            <w:tcW w:type="dxa" w:w="4513"/>
+            <w:tcBorders>
+              <w:top w:val="single" w:color="CCCCCC" w:sz="1"/>
+              <w:left w:val="single" w:color="CCCCCC" w:sz="1"/>
+              <w:bottom w:val="single" w:color="CCCCCC" w:sz="1"/>
+              <w:right w:val="single" w:color="CCCCCC" w:sz="1"/>
+            </w:tcBorders>
+            <w:tcMar>
+              <w:top w:type="dxa" w:w="60"/>
+              <w:left w:type="dxa" w:w="100"/>
+              <w:bottom w:type="dxa" w:w="60"/>
+              <w:right w:type="dxa" w:w="100"/>
+            </w:tcMar>
+          </w:tcPr>
+          <w:p>
+            <w:r>
+              <w:rPr>
+                <w:rFonts w:ascii="Arial" w:cs="Arial" w:eastAsia="Arial" w:hAnsi="Arial"/>
+                <w:b/>
+                <w:bCs/>
+                <w:color w:val="16a34a"/>
+                <w:sz w:val="20"/>
+                <w:szCs w:val="20"/>
+              </w:rPr>
+              <w:t xml:space="preserve">✅ PASS</w:t>
+            </w:r>
+          </w:p>
+        </w:tc>
+      </w:tr>
+      <w:tr>
+        <w:tc>
+          <w:tcPr>
+            <w:tcW w:type="dxa" w:w="4513"/>
+            <w:tcBorders>
+              <w:top w:val="single" w:color="CCCCCC" w:sz="1"/>
+              <w:left w:val="single" w:color="CCCCCC" w:sz="1"/>
+              <w:bottom w:val="single" w:color="CCCCCC" w:sz="1"/>
+              <w:right w:val="single" w:color="CCCCCC" w:sz="1"/>
+            </w:tcBorders>
+            <w:tcMar>
+              <w:top w:type="dxa" w:w="60"/>
+              <w:left w:type="dxa" w:w="100"/>
+              <w:bottom w:type="dxa" w:w="60"/>
+              <w:right w:type="dxa" w:w="100"/>
+            </w:tcMar>
+          </w:tcPr>
+          <w:p>
+            <w:r>
+              <w:rPr>
+                <w:rFonts w:ascii="Arial" w:cs="Arial" w:eastAsia="Arial" w:hAnsi="Arial"/>
+                <w:sz w:val="20"/>
+                <w:szCs w:val="20"/>
+              </w:rPr>
+              <w:t xml:space="preserve">列表来自 API</w:t>
+            </w:r>
+          </w:p>
+        </w:tc>
+        <w:tc>
+          <w:tcPr>
+            <w:tcW w:type="dxa" w:w="4513"/>
+            <w:tcBorders>
+              <w:top w:val="single" w:color="CCCCCC" w:sz="1"/>
+              <w:left w:val="single" w:color="CCCCCC" w:sz="1"/>
+              <w:bottom w:val="single" w:color="CCCCCC" w:sz="1"/>
+              <w:right w:val="single" w:color="CCCCCC" w:sz="1"/>
+            </w:tcBorders>
+            <w:tcMar>
+              <w:top w:type="dxa" w:w="60"/>
+              <w:left w:type="dxa" w:w="100"/>
+              <w:bottom w:type="dxa" w:w="60"/>
+              <w:right w:type="dxa" w:w="100"/>
+            </w:tcMar>
+          </w:tcPr>
+          <w:p>
+            <w:r>
+              <w:rPr>
+                <w:rFonts w:ascii="Arial" w:cs="Arial" w:eastAsia="Arial" w:hAnsi="Arial"/>
+                <w:b/>
+                <w:bCs/>
+                <w:color w:val="16a34a"/>
+                <w:sz w:val="20"/>
+                <w:szCs w:val="20"/>
+              </w:rPr>
+              <w:t xml:space="preserve">✅ PASS</w:t>
+            </w:r>
+          </w:p>
+        </w:tc>
+      </w:tr>
+      <w:tr>
+        <w:tc>
+          <w:tcPr>
+            <w:tcW w:type="dxa" w:w="4513"/>
+            <w:tcBorders>
+              <w:top w:val="single" w:color="CCCCCC" w:sz="1"/>
+              <w:left w:val="single" w:color="CCCCCC" w:sz="1"/>
+              <w:bottom w:val="single" w:color="CCCCCC" w:sz="1"/>
+              <w:right w:val="single" w:color="CCCCCC" w:sz="1"/>
+            </w:tcBorders>
+            <w:tcMar>
+              <w:top w:type="dxa" w:w="60"/>
+              <w:left w:type="dxa" w:w="100"/>
+              <w:bottom w:type="dxa" w:w="60"/>
+              <w:right w:type="dxa" w:w="100"/>
+            </w:tcMar>
+          </w:tcPr>
+          <w:p>
+            <w:r>
+              <w:rPr>
+                <w:rFonts w:ascii="Arial" w:cs="Arial" w:eastAsia="Arial" w:hAnsi="Arial"/>
+                <w:sz w:val="20"/>
+                <w:szCs w:val="20"/>
+              </w:rPr>
+              <w:t xml:space="preserve">详情来自 API</w:t>
+            </w:r>
+          </w:p>
+        </w:tc>
+        <w:tc>
+          <w:tcPr>
+            <w:tcW w:type="dxa" w:w="4513"/>
+            <w:tcBorders>
+              <w:top w:val="single" w:color="CCCCCC" w:sz="1"/>
+              <w:left w:val="single" w:color="CCCCCC" w:sz="1"/>
+              <w:bottom w:val="single" w:color="CCCCCC" w:sz="1"/>
+              <w:right w:val="single" w:color="CCCCCC" w:sz="1"/>
+            </w:tcBorders>
+            <w:tcMar>
+              <w:top w:type="dxa" w:w="60"/>
+              <w:left w:type="dxa" w:w="100"/>
+              <w:bottom w:type="dxa" w:w="60"/>
+              <w:right w:type="dxa" w:w="100"/>
+            </w:tcMar>
+          </w:tcPr>
+          <w:p>
+            <w:r>
+              <w:rPr>
+                <w:rFonts w:ascii="Arial" w:cs="Arial" w:eastAsia="Arial" w:hAnsi="Arial"/>
+                <w:b/>
+                <w:bCs/>
+                <w:color w:val="16a34a"/>
+                <w:sz w:val="20"/>
+                <w:szCs w:val="20"/>
+              </w:rPr>
+              <w:t xml:space="preserve">✅ PASS</w:t>
+            </w:r>
+          </w:p>
+        </w:tc>
+      </w:tr>
+      <w:tr>
+        <w:tc>
+          <w:tcPr>
+            <w:tcW w:type="dxa" w:w="4513"/>
+            <w:tcBorders>
+              <w:top w:val="single" w:color="CCCCCC" w:sz="1"/>
+              <w:left w:val="single" w:color="CCCCCC" w:sz="1"/>
+              <w:bottom w:val="single" w:color="CCCCCC" w:sz="1"/>
+              <w:right w:val="single" w:color="CCCCCC" w:sz="1"/>
+            </w:tcBorders>
+            <w:tcMar>
+              <w:top w:type="dxa" w:w="60"/>
+              <w:left w:type="dxa" w:w="100"/>
+              <w:bottom w:type="dxa" w:w="60"/>
+              <w:right w:type="dxa" w:w="100"/>
+            </w:tcMar>
+          </w:tcPr>
+          <w:p>
+            <w:r>
+              <w:rPr>
+                <w:rFonts w:ascii="Arial" w:cs="Arial" w:eastAsia="Arial" w:hAnsi="Arial"/>
+                <w:sz w:val="20"/>
+                <w:szCs w:val="20"/>
+              </w:rPr>
+              <w:t xml:space="preserve">权限在服务端过滤</w:t>
+            </w:r>
+          </w:p>
+        </w:tc>
+        <w:tc>
+          <w:tcPr>
+            <w:tcW w:type="dxa" w:w="4513"/>
+            <w:tcBorders>
+              <w:top w:val="single" w:color="CCCCCC" w:sz="1"/>
+              <w:left w:val="single" w:color="CCCCCC" w:sz="1"/>
+              <w:bottom w:val="single" w:color="CCCCCC" w:sz="1"/>
+              <w:right w:val="single" w:color="CCCCCC" w:sz="1"/>
+            </w:tcBorders>
+            <w:tcMar>
+              <w:top w:type="dxa" w:w="60"/>
+              <w:left w:type="dxa" w:w="100"/>
+              <w:bottom w:type="dxa" w:w="60"/>
+              <w:right w:type="dxa" w:w="100"/>
+            </w:tcMar>
+          </w:tcPr>
+          <w:p>
+            <w:r>
+              <w:rPr>
+                <w:rFonts w:ascii="Arial" w:cs="Arial" w:eastAsia="Arial" w:hAnsi="Arial"/>
+                <w:b/>
+                <w:bCs/>
+                <w:color w:val="16a34a"/>
+                <w:sz w:val="20"/>
+                <w:szCs w:val="20"/>
+              </w:rPr>
+              <w:t xml:space="preserve">✅ PASS</w:t>
+            </w:r>
+          </w:p>
+        </w:tc>
+      </w:tr>
+      <w:tr>
+        <w:tc>
+          <w:tcPr>
+            <w:tcW w:type="dxa" w:w="4513"/>
+            <w:tcBorders>
+              <w:top w:val="single" w:color="CCCCCC" w:sz="1"/>
+              <w:left w:val="single" w:color="CCCCCC" w:sz="1"/>
+              <w:bottom w:val="single" w:color="CCCCCC" w:sz="1"/>
+              <w:right w:val="single" w:color="CCCCCC" w:sz="1"/>
+            </w:tcBorders>
+            <w:tcMar>
+              <w:top w:type="dxa" w:w="60"/>
+              <w:left w:type="dxa" w:w="100"/>
+              <w:bottom w:type="dxa" w:w="60"/>
+              <w:right w:type="dxa" w:w="100"/>
+            </w:tcMar>
+          </w:tcPr>
+          <w:p>
+            <w:r>
+              <w:rPr>
+                <w:rFonts w:ascii="Arial" w:cs="Arial" w:eastAsia="Arial" w:hAnsi="Arial"/>
+                <w:b/>
+                <w:bCs/>
+                <w:sz w:val="20"/>
+                <w:szCs w:val="20"/>
+              </w:rPr>
+              <w:t xml:space="preserve">前端硬编码 KPI</w:t>
+            </w:r>
+          </w:p>
+        </w:tc>
+        <w:tc>
+          <w:tcPr>
+            <w:tcW w:type="dxa" w:w="4513"/>
+            <w:tcBorders>
+              <w:top w:val="single" w:color="CCCCCC" w:sz="1"/>
+              <w:left w:val="single" w:color="CCCCCC" w:sz="1"/>
+              <w:bottom w:val="single" w:color="CCCCCC" w:sz="1"/>
+              <w:right w:val="single" w:color="CCCCCC" w:sz="1"/>
+            </w:tcBorders>
+            <w:tcMar>
+              <w:top w:type="dxa" w:w="60"/>
+              <w:left w:type="dxa" w:w="100"/>
+              <w:bottom w:type="dxa" w:w="60"/>
+              <w:right w:type="dxa" w:w="100"/>
+            </w:tcMar>
+          </w:tcPr>
+          <w:p>
+            <w:r>
+              <w:rPr>
+                <w:rFonts w:ascii="Arial" w:cs="Arial" w:eastAsia="Arial" w:hAnsi="Arial"/>
+                <w:b/>
+                <w:bCs/>
+                <w:color w:val="16a34a"/>
+                <w:sz w:val="20"/>
+                <w:szCs w:val="20"/>
+              </w:rPr>
+              <w:t xml:space="preserve">否</w:t>
+            </w:r>
+          </w:p>
+        </w:tc>
+      </w:tr>
+      <w:tr>
+        <w:tc>
+          <w:tcPr>
+            <w:tcW w:type="dxa" w:w="4513"/>
+            <w:tcBorders>
+              <w:top w:val="single" w:color="CCCCCC" w:sz="1"/>
+              <w:left w:val="single" w:color="CCCCCC" w:sz="1"/>
+              <w:bottom w:val="single" w:color="CCCCCC" w:sz="1"/>
+              <w:right w:val="single" w:color="CCCCCC" w:sz="1"/>
+            </w:tcBorders>
+            <w:tcMar>
+              <w:top w:type="dxa" w:w="60"/>
+              <w:left w:type="dxa" w:w="100"/>
+              <w:bottom w:type="dxa" w:w="60"/>
+              <w:right w:type="dxa" w:w="100"/>
+            </w:tcMar>
+          </w:tcPr>
+          <w:p>
+            <w:r>
+              <w:rPr>
+                <w:rFonts w:ascii="Arial" w:cs="Arial" w:eastAsia="Arial" w:hAnsi="Arial"/>
+                <w:b/>
+                <w:bCs/>
+                <w:sz w:val="20"/>
+                <w:szCs w:val="20"/>
+              </w:rPr>
+              <w:t xml:space="preserve">前端硬编码业务数据</w:t>
+            </w:r>
+          </w:p>
+        </w:tc>
+        <w:tc>
+          <w:tcPr>
+            <w:tcW w:type="dxa" w:w="4513"/>
+            <w:tcBorders>
+              <w:top w:val="single" w:color="CCCCCC" w:sz="1"/>
+              <w:left w:val="single" w:color="CCCCCC" w:sz="1"/>
+              <w:bottom w:val="single" w:color="CCCCCC" w:sz="1"/>
+              <w:right w:val="single" w:color="CCCCCC" w:sz="1"/>
+            </w:tcBorders>
+            <w:tcMar>
+              <w:top w:type="dxa" w:w="60"/>
+              <w:left w:type="dxa" w:w="100"/>
+              <w:bottom w:type="dxa" w:w="60"/>
+              <w:right w:type="dxa" w:w="100"/>
+            </w:tcMar>
+          </w:tcPr>
+          <w:p>
+            <w:r>
+              <w:rPr>
+                <w:rFonts w:ascii="Arial" w:cs="Arial" w:eastAsia="Arial" w:hAnsi="Arial"/>
+                <w:b/>
+                <w:bCs/>
+                <w:color w:val="16a34a"/>
+                <w:sz w:val="20"/>
+                <w:szCs w:val="20"/>
+              </w:rPr>
+              <w:t xml:space="preserve">否</w:t>
+            </w:r>
+          </w:p>
+        </w:tc>
+      </w:tr>
+      <w:tr>
+        <w:tc>
+          <w:tcPr>
+            <w:tcW w:type="dxa" w:w="4513"/>
+            <w:tcBorders>
+              <w:top w:val="single" w:color="CCCCCC" w:sz="1"/>
+              <w:left w:val="single" w:color="CCCCCC" w:sz="1"/>
+              <w:bottom w:val="single" w:color="CCCCCC" w:sz="1"/>
+              <w:right w:val="single" w:color="CCCCCC" w:sz="1"/>
+            </w:tcBorders>
+            <w:tcMar>
+              <w:top w:type="dxa" w:w="60"/>
+              <w:left w:type="dxa" w:w="100"/>
+              <w:bottom w:type="dxa" w:w="60"/>
+              <w:right w:type="dxa" w:w="100"/>
+            </w:tcMar>
+          </w:tcPr>
+          <w:p>
+            <w:r>
+              <w:rPr>
+                <w:rFonts w:ascii="Arial" w:cs="Arial" w:eastAsia="Arial" w:hAnsi="Arial"/>
+                <w:b/>
+                <w:bCs/>
+                <w:sz w:val="20"/>
+                <w:szCs w:val="20"/>
+              </w:rPr>
+              <w:t xml:space="preserve">mock 数据冒充真实 DB</w:t>
+            </w:r>
+          </w:p>
+        </w:tc>
+        <w:tc>
+          <w:tcPr>
+            <w:tcW w:type="dxa" w:w="4513"/>
+            <w:tcBorders>
+              <w:top w:val="single" w:color="CCCCCC" w:sz="1"/>
+              <w:left w:val="single" w:color="CCCCCC" w:sz="1"/>
+              <w:bottom w:val="single" w:color="CCCCCC" w:sz="1"/>
+              <w:right w:val="single" w:color="CCCCCC" w:sz="1"/>
+            </w:tcBorders>
+            <w:tcMar>
+              <w:top w:type="dxa" w:w="60"/>
+              <w:left w:type="dxa" w:w="100"/>
+              <w:bottom w:type="dxa" w:w="60"/>
+              <w:right w:type="dxa" w:w="100"/>
+            </w:tcMar>
+          </w:tcPr>
+          <w:p>
+            <w:r>
+              <w:rPr>
+                <w:rFonts w:ascii="Arial" w:cs="Arial" w:eastAsia="Arial" w:hAnsi="Arial"/>
+                <w:b/>
+                <w:bCs/>
+                <w:color w:val="16a34a"/>
+                <w:sz w:val="20"/>
+                <w:szCs w:val="20"/>
+              </w:rPr>
+              <w:t xml:space="preserve">否</w:t>
+            </w:r>
+          </w:p>
+        </w:tc>
+      </w:tr>
+    </w:tbl>
+    <w:p>
+      <w:pPr>
+        <w:spacing w:before="80"/>
+      </w:pPr>
+      <w:r>
+        <w:rPr>
+          <w:rFonts w:ascii="Arial" w:cs="Arial" w:eastAsia="Arial" w:hAnsi="Arial"/>
+          <w:b/>
+          <w:bCs/>
+          <w:sz w:val="20"/>
+          <w:szCs w:val="20"/>
+        </w:rPr>
+        <w:t xml:space="preserve">API: GET /api/jobs + GET /api/jobs/:id</w:t>
+      </w:r>
+    </w:p>
+    <w:p>
+      <w:pPr>
+        <w:pStyle w:val="ListParagraph"/>
+        <w:numPr>
+          <w:ilvl w:val="0"/>
+          <w:numId w:val="2"/>
+        </w:numPr>
+        <w:spacing w:after="40"/>
+      </w:pPr>
+      <w:r>
+        <w:t xml:space="preserve">Service: server/services/jobs/job-service.ts — 业务聚合 + 漏斗统计</w:t>
+      </w:r>
+    </w:p>
+    <w:p>
+      <w:pPr>
+        <w:pStyle w:val="ListParagraph"/>
+        <w:numPr>
+          <w:ilvl w:val="0"/>
+          <w:numId w:val="2"/>
+        </w:numPr>
+        <w:spacing w:after="40"/>
+      </w:pPr>
+      <w:r>
+        <w:t xml:space="preserve">Repository: server/repositories/job-repository.ts — Prisma 查询 + Scope where 过滤</w:t>
+      </w:r>
+    </w:p>
+    <w:p>
+      <w:pPr>
+        <w:pStyle w:val="ListParagraph"/>
+        <w:numPr>
+          <w:ilvl w:val="0"/>
+          <w:numId w:val="2"/>
+        </w:numPr>
+        <w:spacing w:after="40"/>
+      </w:pPr>
+      <w:r>
+        <w:t xml:space="preserve">Prisma 查询点: job.findMany (含 include department/owner/applications)</w:t>
+      </w:r>
+    </w:p>
+    <w:p>
+      <w:pPr>
+        <w:pStyle w:val="ListParagraph"/>
+        <w:numPr>
+          <w:ilvl w:val="0"/>
+          <w:numId w:val="2"/>
+        </w:numPr>
+        <w:spacing w:after="40"/>
+      </w:pPr>
+      <w:r>
+        <w:t xml:space="preserve">KPI 聚合: 在页面 useCallback 中对 API 返回数据做 count/filter (highPriority/activeRecruiting/profileComplete)</w:t>
+      </w:r>
+    </w:p>
+    <w:p>
+      <w:pPr>
+        <w:pStyle w:val="ListParagraph"/>
+        <w:numPr>
+          <w:ilvl w:val="0"/>
+          <w:numId w:val="2"/>
+        </w:numPr>
+        <w:spacing w:after="40"/>
+      </w:pPr>
+      <w:r>
+        <w:t xml:space="preserve">权限过滤: job-repository.ts 的 where 子句根据 scope 构建 (DEPARTMENT→departmentId, OWNED→ownerId, RELATED→OR, DENY→空)</w:t>
+      </w:r>
+    </w:p>
+    <w:p>
+      <w:pPr>
+        <w:pStyle w:val="Heading2"/>
+      </w:pPr>
+      <w:r>
+        <w:t xml:space="preserve">三、红线二：外部 API 接入预留证明</w:t>
+      </w:r>
+    </w:p>
+    <w:tbl>
+      <w:tblPr>
+        <w:tblW w:type="dxa" w:w="9026"/>
+        <w:tblBorders>
+          <w:top w:val="single" w:color="auto" w:sz="4"/>
+          <w:left w:val="single" w:color="auto" w:sz="4"/>
+          <w:bottom w:val="single" w:color="auto" w:sz="4"/>
+          <w:right w:val="single" w:color="auto" w:sz="4"/>
+          <w:insideH w:val="single" w:color="auto" w:sz="4"/>
+          <w:insideV w:val="single" w:color="auto" w:sz="4"/>
+        </w:tblBorders>
+      </w:tblPr>
+      <w:tblGrid>
+        <w:gridCol w:w="4513"/>
+        <w:gridCol w:w="4513"/>
+      </w:tblGrid>
+      <w:tr>
+        <w:tc>
+          <w:tcPr>
+            <w:tcW w:type="dxa" w:w="4513"/>
+            <w:tcBorders>
+              <w:top w:val="single" w:color="CCCCCC" w:sz="1"/>
+              <w:left w:val="single" w:color="CCCCCC" w:sz="1"/>
+              <w:bottom w:val="single" w:color="CCCCCC" w:sz="1"/>
+              <w:right w:val="single" w:color="CCCCCC" w:sz="1"/>
+            </w:tcBorders>
+            <w:shd w:fill="2563eb" w:val="clear"/>
+            <w:tcMar>
+              <w:top w:type="dxa" w:w="60"/>
+              <w:left w:type="dxa" w:w="100"/>
+              <w:bottom w:type="dxa" w:w="60"/>
+              <w:right w:type="dxa" w:w="100"/>
+            </w:tcMar>
+          </w:tcPr>
+          <w:p>
+            <w:r>
+              <w:rPr>
+                <w:rFonts w:ascii="Arial" w:cs="Arial" w:eastAsia="Arial" w:hAnsi="Arial"/>
+                <w:b/>
+                <w:bCs/>
+                <w:color w:val="FFFFFF"/>
+                <w:sz w:val="20"/>
+                <w:szCs w:val="20"/>
+              </w:rPr>
+              <w:t xml:space="preserve">检查项</w:t>
+            </w:r>
+          </w:p>
+        </w:tc>
+        <w:tc>
+          <w:tcPr>
+            <w:tcW w:type="dxa" w:w="4513"/>
+            <w:tcBorders>
+              <w:top w:val="single" w:color="CCCCCC" w:sz="1"/>
+              <w:left w:val="single" w:color="CCCCCC" w:sz="1"/>
+              <w:bottom w:val="single" w:color="CCCCCC" w:sz="1"/>
+              <w:right w:val="single" w:color="CCCCCC" w:sz="1"/>
+            </w:tcBorders>
+            <w:shd w:fill="2563eb" w:val="clear"/>
+            <w:tcMar>
+              <w:top w:type="dxa" w:w="60"/>
+              <w:left w:type="dxa" w:w="100"/>
+              <w:bottom w:type="dxa" w:w="60"/>
+              <w:right w:type="dxa" w:w="100"/>
+            </w:tcMar>
+          </w:tcPr>
+          <w:p>
+            <w:r>
+              <w:rPr>
+                <w:rFonts w:ascii="Arial" w:cs="Arial" w:eastAsia="Arial" w:hAnsi="Arial"/>
+                <w:b/>
+                <w:bCs/>
+                <w:color w:val="FFFFFF"/>
+                <w:sz w:val="20"/>
+                <w:szCs w:val="20"/>
+              </w:rPr>
+              <w:t xml:space="preserve">结果</w:t>
+            </w:r>
+          </w:p>
+        </w:tc>
+      </w:tr>
+      <w:tr>
+        <w:tc>
+          <w:tcPr>
+            <w:tcW w:type="dxa" w:w="4513"/>
+            <w:tcBorders>
+              <w:top w:val="single" w:color="CCCCCC" w:sz="1"/>
+              <w:left w:val="single" w:color="CCCCCC" w:sz="1"/>
+              <w:bottom w:val="single" w:color="CCCCCC" w:sz="1"/>
+              <w:right w:val="single" w:color="CCCCCC" w:sz="1"/>
+            </w:tcBorders>
+            <w:tcMar>
+              <w:top w:type="dxa" w:w="60"/>
+              <w:left w:type="dxa" w:w="100"/>
+              <w:bottom w:type="dxa" w:w="60"/>
+              <w:right w:type="dxa" w:w="100"/>
+            </w:tcMar>
+          </w:tcPr>
+          <w:p>
+            <w:r>
+              <w:rPr>
+                <w:rFonts w:ascii="Arial" w:cs="Arial" w:eastAsia="Arial" w:hAnsi="Arial"/>
+                <w:sz w:val="20"/>
+                <w:szCs w:val="20"/>
+              </w:rPr>
+              <w:t xml:space="preserve">OpenAI adapter 是否预留</w:t>
+            </w:r>
+          </w:p>
+        </w:tc>
+        <w:tc>
+          <w:tcPr>
+            <w:tcW w:type="dxa" w:w="4513"/>
+            <w:tcBorders>
+              <w:top w:val="single" w:color="CCCCCC" w:sz="1"/>
+              <w:left w:val="single" w:color="CCCCCC" w:sz="1"/>
+              <w:bottom w:val="single" w:color="CCCCCC" w:sz="1"/>
+              <w:right w:val="single" w:color="CCCCCC" w:sz="1"/>
+            </w:tcBorders>
+            <w:tcMar>
+              <w:top w:type="dxa" w:w="60"/>
+              <w:left w:type="dxa" w:w="100"/>
+              <w:bottom w:type="dxa" w:w="60"/>
+              <w:right w:type="dxa" w:w="100"/>
+            </w:tcMar>
+          </w:tcPr>
+          <w:p>
+            <w:r>
+              <w:rPr>
+                <w:rFonts w:ascii="Arial" w:cs="Arial" w:eastAsia="Arial" w:hAnsi="Arial"/>
+                <w:b/>
+                <w:bCs/>
+                <w:color w:val="16a34a"/>
+                <w:sz w:val="20"/>
+                <w:szCs w:val="20"/>
+              </w:rPr>
+              <w:t xml:space="preserve">✅ PASS</w:t>
+            </w:r>
+          </w:p>
+        </w:tc>
+      </w:tr>
+      <w:tr>
+        <w:tc>
+          <w:tcPr>
+            <w:tcW w:type="dxa" w:w="4513"/>
+            <w:tcBorders>
+              <w:top w:val="single" w:color="CCCCCC" w:sz="1"/>
+              <w:left w:val="single" w:color="CCCCCC" w:sz="1"/>
+              <w:bottom w:val="single" w:color="CCCCCC" w:sz="1"/>
+              <w:right w:val="single" w:color="CCCCCC" w:sz="1"/>
+            </w:tcBorders>
+            <w:tcMar>
+              <w:top w:type="dxa" w:w="60"/>
+              <w:left w:type="dxa" w:w="100"/>
+              <w:bottom w:type="dxa" w:w="60"/>
+              <w:right w:type="dxa" w:w="100"/>
+            </w:tcMar>
+          </w:tcPr>
+          <w:p>
+            <w:r>
+              <w:rPr>
+                <w:rFonts w:ascii="Arial" w:cs="Arial" w:eastAsia="Arial" w:hAnsi="Arial"/>
+                <w:sz w:val="20"/>
+                <w:szCs w:val="20"/>
+              </w:rPr>
+              <w:t xml:space="preserve">DeepSeek adapter 是否预留</w:t>
+            </w:r>
+          </w:p>
+        </w:tc>
+        <w:tc>
+          <w:tcPr>
+            <w:tcW w:type="dxa" w:w="4513"/>
+            <w:tcBorders>
+              <w:top w:val="single" w:color="CCCCCC" w:sz="1"/>
+              <w:left w:val="single" w:color="CCCCCC" w:sz="1"/>
+              <w:bottom w:val="single" w:color="CCCCCC" w:sz="1"/>
+              <w:right w:val="single" w:color="CCCCCC" w:sz="1"/>
+            </w:tcBorders>
+            <w:tcMar>
+              <w:top w:type="dxa" w:w="60"/>
+              <w:left w:type="dxa" w:w="100"/>
+              <w:bottom w:type="dxa" w:w="60"/>
+              <w:right w:type="dxa" w:w="100"/>
+            </w:tcMar>
+          </w:tcPr>
+          <w:p>
+            <w:r>
+              <w:rPr>
+                <w:rFonts w:ascii="Arial" w:cs="Arial" w:eastAsia="Arial" w:hAnsi="Arial"/>
+                <w:b/>
+                <w:bCs/>
+                <w:color w:val="16a34a"/>
+                <w:sz w:val="20"/>
+                <w:szCs w:val="20"/>
+              </w:rPr>
+              <w:t xml:space="preserve">✅ PASS</w:t>
+            </w:r>
+          </w:p>
+        </w:tc>
+      </w:tr>
+      <w:tr>
+        <w:tc>
+          <w:tcPr>
+            <w:tcW w:type="dxa" w:w="4513"/>
+            <w:tcBorders>
+              <w:top w:val="single" w:color="CCCCCC" w:sz="1"/>
+              <w:left w:val="single" w:color="CCCCCC" w:sz="1"/>
+              <w:bottom w:val="single" w:color="CCCCCC" w:sz="1"/>
+              <w:right w:val="single" w:color="CCCCCC" w:sz="1"/>
+            </w:tcBorders>
+            <w:tcMar>
+              <w:top w:type="dxa" w:w="60"/>
+              <w:left w:type="dxa" w:w="100"/>
+              <w:bottom w:type="dxa" w:w="60"/>
+              <w:right w:type="dxa" w:w="100"/>
+            </w:tcMar>
+          </w:tcPr>
+          <w:p>
+            <w:r>
+              <w:rPr>
+                <w:rFonts w:ascii="Arial" w:cs="Arial" w:eastAsia="Arial" w:hAnsi="Arial"/>
+                <w:sz w:val="20"/>
+                <w:szCs w:val="20"/>
+              </w:rPr>
+              <w:t xml:space="preserve">Moka adapter 是否预留</w:t>
+            </w:r>
+          </w:p>
+        </w:tc>
+        <w:tc>
+          <w:tcPr>
+            <w:tcW w:type="dxa" w:w="4513"/>
+            <w:tcBorders>
+              <w:top w:val="single" w:color="CCCCCC" w:sz="1"/>
+              <w:left w:val="single" w:color="CCCCCC" w:sz="1"/>
+              <w:bottom w:val="single" w:color="CCCCCC" w:sz="1"/>
+              <w:right w:val="single" w:color="CCCCCC" w:sz="1"/>
+            </w:tcBorders>
+            <w:tcMar>
+              <w:top w:type="dxa" w:w="60"/>
+              <w:left w:type="dxa" w:w="100"/>
+              <w:bottom w:type="dxa" w:w="60"/>
+              <w:right w:type="dxa" w:w="100"/>
+            </w:tcMar>
+          </w:tcPr>
+          <w:p>
+            <w:r>
+              <w:rPr>
+                <w:rFonts w:ascii="Arial" w:cs="Arial" w:eastAsia="Arial" w:hAnsi="Arial"/>
+                <w:b/>
+                <w:bCs/>
+                <w:color w:val="16a34a"/>
+                <w:sz w:val="20"/>
+                <w:szCs w:val="20"/>
+              </w:rPr>
+              <w:t xml:space="preserve">✅ PASS</w:t>
+            </w:r>
+          </w:p>
+        </w:tc>
+      </w:tr>
+      <w:tr>
+        <w:tc>
+          <w:tcPr>
+            <w:tcW w:type="dxa" w:w="4513"/>
+            <w:tcBorders>
+              <w:top w:val="single" w:color="CCCCCC" w:sz="1"/>
+              <w:left w:val="single" w:color="CCCCCC" w:sz="1"/>
+              <w:bottom w:val="single" w:color="CCCCCC" w:sz="1"/>
+              <w:right w:val="single" w:color="CCCCCC" w:sz="1"/>
+            </w:tcBorders>
+            <w:tcMar>
+              <w:top w:type="dxa" w:w="60"/>
+              <w:left w:type="dxa" w:w="100"/>
+              <w:bottom w:type="dxa" w:w="60"/>
+              <w:right w:type="dxa" w:w="100"/>
+            </w:tcMar>
+          </w:tcPr>
+          <w:p>
+            <w:r>
+              <w:rPr>
+                <w:rFonts w:ascii="Arial" w:cs="Arial" w:eastAsia="Arial" w:hAnsi="Arial"/>
+                <w:sz w:val="20"/>
+                <w:szCs w:val="20"/>
+              </w:rPr>
+              <w:t xml:space="preserve">Feishu adapter 是否预留</w:t>
+            </w:r>
+          </w:p>
+        </w:tc>
+        <w:tc>
+          <w:tcPr>
+            <w:tcW w:type="dxa" w:w="4513"/>
+            <w:tcBorders>
+              <w:top w:val="single" w:color="CCCCCC" w:sz="1"/>
+              <w:left w:val="single" w:color="CCCCCC" w:sz="1"/>
+              <w:bottom w:val="single" w:color="CCCCCC" w:sz="1"/>
+              <w:right w:val="single" w:color="CCCCCC" w:sz="1"/>
+            </w:tcBorders>
+            <w:tcMar>
+              <w:top w:type="dxa" w:w="60"/>
+              <w:left w:type="dxa" w:w="100"/>
+              <w:bottom w:type="dxa" w:w="60"/>
+              <w:right w:type="dxa" w:w="100"/>
+            </w:tcMar>
+          </w:tcPr>
+          <w:p>
+            <w:r>
+              <w:rPr>
+                <w:rFonts w:ascii="Arial" w:cs="Arial" w:eastAsia="Arial" w:hAnsi="Arial"/>
+                <w:b/>
+                <w:bCs/>
+                <w:color w:val="16a34a"/>
+                <w:sz w:val="20"/>
+                <w:szCs w:val="20"/>
+              </w:rPr>
+              <w:t xml:space="preserve">✅ PASS</w:t>
+            </w:r>
+          </w:p>
+        </w:tc>
+      </w:tr>
+      <w:tr>
+        <w:tc>
+          <w:tcPr>
+            <w:tcW w:type="dxa" w:w="4513"/>
+            <w:tcBorders>
+              <w:top w:val="single" w:color="CCCCCC" w:sz="1"/>
+              <w:left w:val="single" w:color="CCCCCC" w:sz="1"/>
+              <w:bottom w:val="single" w:color="CCCCCC" w:sz="1"/>
+              <w:right w:val="single" w:color="CCCCCC" w:sz="1"/>
+            </w:tcBorders>
+            <w:tcMar>
+              <w:top w:type="dxa" w:w="60"/>
+              <w:left w:type="dxa" w:w="100"/>
+              <w:bottom w:type="dxa" w:w="60"/>
+              <w:right w:type="dxa" w:w="100"/>
+            </w:tcMar>
+          </w:tcPr>
+          <w:p>
+            <w:r>
+              <w:rPr>
+                <w:rFonts w:ascii="Arial" w:cs="Arial" w:eastAsia="Arial" w:hAnsi="Arial"/>
+                <w:sz w:val="20"/>
+                <w:szCs w:val="20"/>
+              </w:rPr>
+              <w:t xml:space="preserve">.env.example 是否补齐</w:t>
+            </w:r>
+          </w:p>
+        </w:tc>
+        <w:tc>
+          <w:tcPr>
+            <w:tcW w:type="dxa" w:w="4513"/>
+            <w:tcBorders>
+              <w:top w:val="single" w:color="CCCCCC" w:sz="1"/>
+              <w:left w:val="single" w:color="CCCCCC" w:sz="1"/>
+              <w:bottom w:val="single" w:color="CCCCCC" w:sz="1"/>
+              <w:right w:val="single" w:color="CCCCCC" w:sz="1"/>
+            </w:tcBorders>
+            <w:tcMar>
+              <w:top w:type="dxa" w:w="60"/>
+              <w:left w:type="dxa" w:w="100"/>
+              <w:bottom w:type="dxa" w:w="60"/>
+              <w:right w:type="dxa" w:w="100"/>
+            </w:tcMar>
+          </w:tcPr>
+          <w:p>
+            <w:r>
+              <w:rPr>
+                <w:rFonts w:ascii="Arial" w:cs="Arial" w:eastAsia="Arial" w:hAnsi="Arial"/>
+                <w:b/>
+                <w:bCs/>
+                <w:color w:val="16a34a"/>
+                <w:sz w:val="20"/>
+                <w:szCs w:val="20"/>
+              </w:rPr>
+              <w:t xml:space="preserve">✅ PASS</w:t>
+            </w:r>
+          </w:p>
+        </w:tc>
+      </w:tr>
+      <w:tr>
+        <w:tc>
+          <w:tcPr>
+            <w:tcW w:type="dxa" w:w="4513"/>
+            <w:tcBorders>
+              <w:top w:val="single" w:color="CCCCCC" w:sz="1"/>
+              <w:left w:val="single" w:color="CCCCCC" w:sz="1"/>
+              <w:bottom w:val="single" w:color="CCCCCC" w:sz="1"/>
+              <w:right w:val="single" w:color="CCCCCC" w:sz="1"/>
+            </w:tcBorders>
+            <w:tcMar>
+              <w:top w:type="dxa" w:w="60"/>
+              <w:left w:type="dxa" w:w="100"/>
+              <w:bottom w:type="dxa" w:w="60"/>
+              <w:right w:type="dxa" w:w="100"/>
+            </w:tcMar>
+          </w:tcPr>
+          <w:p>
+            <w:r>
+              <w:rPr>
+                <w:rFonts w:ascii="Arial" w:cs="Arial" w:eastAsia="Arial" w:hAnsi="Arial"/>
+                <w:b/>
+                <w:bCs/>
+                <w:sz w:val="20"/>
+                <w:szCs w:val="20"/>
+              </w:rPr>
+              <w:t xml:space="preserve">是否提交真实 API Key</w:t>
+            </w:r>
+          </w:p>
+        </w:tc>
+        <w:tc>
+          <w:tcPr>
+            <w:tcW w:type="dxa" w:w="4513"/>
+            <w:tcBorders>
+              <w:top w:val="single" w:color="CCCCCC" w:sz="1"/>
+              <w:left w:val="single" w:color="CCCCCC" w:sz="1"/>
+              <w:bottom w:val="single" w:color="CCCCCC" w:sz="1"/>
+              <w:right w:val="single" w:color="CCCCCC" w:sz="1"/>
+            </w:tcBorders>
+            <w:tcMar>
+              <w:top w:type="dxa" w:w="60"/>
+              <w:left w:type="dxa" w:w="100"/>
+              <w:bottom w:type="dxa" w:w="60"/>
+              <w:right w:type="dxa" w:w="100"/>
+            </w:tcMar>
+          </w:tcPr>
+          <w:p>
+            <w:r>
+              <w:rPr>
+                <w:rFonts w:ascii="Arial" w:cs="Arial" w:eastAsia="Arial" w:hAnsi="Arial"/>
+                <w:b/>
+                <w:bCs/>
+                <w:color w:val="16a34a"/>
+                <w:sz w:val="20"/>
+                <w:szCs w:val="20"/>
+              </w:rPr>
+              <w:t xml:space="preserve">否</w:t>
+            </w:r>
+          </w:p>
+        </w:tc>
+      </w:tr>
+      <w:tr>
+        <w:tc>
+          <w:tcPr>
+            <w:tcW w:type="dxa" w:w="4513"/>
+            <w:tcBorders>
+              <w:top w:val="single" w:color="CCCCCC" w:sz="1"/>
+              <w:left w:val="single" w:color="CCCCCC" w:sz="1"/>
+              <w:bottom w:val="single" w:color="CCCCCC" w:sz="1"/>
+              <w:right w:val="single" w:color="CCCCCC" w:sz="1"/>
+            </w:tcBorders>
+            <w:tcMar>
+              <w:top w:type="dxa" w:w="60"/>
+              <w:left w:type="dxa" w:w="100"/>
+              <w:bottom w:type="dxa" w:w="60"/>
+              <w:right w:type="dxa" w:w="100"/>
+            </w:tcMar>
+          </w:tcPr>
+          <w:p>
+            <w:r>
+              <w:rPr>
+                <w:rFonts w:ascii="Arial" w:cs="Arial" w:eastAsia="Arial" w:hAnsi="Arial"/>
+                <w:b/>
+                <w:bCs/>
+                <w:sz w:val="20"/>
+                <w:szCs w:val="20"/>
+              </w:rPr>
+              <w:t xml:space="preserve">是否真实调用外部 API</w:t>
+            </w:r>
+          </w:p>
+        </w:tc>
+        <w:tc>
+          <w:tcPr>
+            <w:tcW w:type="dxa" w:w="4513"/>
+            <w:tcBorders>
+              <w:top w:val="single" w:color="CCCCCC" w:sz="1"/>
+              <w:left w:val="single" w:color="CCCCCC" w:sz="1"/>
+              <w:bottom w:val="single" w:color="CCCCCC" w:sz="1"/>
+              <w:right w:val="single" w:color="CCCCCC" w:sz="1"/>
+            </w:tcBorders>
+            <w:tcMar>
+              <w:top w:type="dxa" w:w="60"/>
+              <w:left w:type="dxa" w:w="100"/>
+              <w:bottom w:type="dxa" w:w="60"/>
+              <w:right w:type="dxa" w:w="100"/>
+            </w:tcMar>
+          </w:tcPr>
+          <w:p>
+            <w:r>
+              <w:rPr>
+                <w:rFonts w:ascii="Arial" w:cs="Arial" w:eastAsia="Arial" w:hAnsi="Arial"/>
+                <w:b/>
+                <w:bCs/>
+                <w:color w:val="16a34a"/>
+                <w:sz w:val="20"/>
+                <w:szCs w:val="20"/>
+              </w:rPr>
+              <w:t xml:space="preserve">否</w:t>
+            </w:r>
+          </w:p>
+        </w:tc>
+      </w:tr>
+    </w:tbl>
+    <w:p>
+      <w:pPr>
+        <w:spacing w:before="80"/>
+      </w:pPr>
+      <w:r>
+        <w:rPr>
+          <w:rFonts w:ascii="Arial" w:cs="Arial" w:eastAsia="Arial" w:hAnsi="Arial"/>
+          <w:b/>
+          <w:bCs/>
+          <w:sz w:val="20"/>
+          <w:szCs w:val="20"/>
+        </w:rPr>
+        <w:t xml:space="preserve">Adapter 预留文件:</w:t>
+      </w:r>
+    </w:p>
+    <w:p>
+      <w:pPr>
+        <w:pStyle w:val="ListParagraph"/>
+        <w:numPr>
+          <w:ilvl w:val="0"/>
+          <w:numId w:val="2"/>
+        </w:numPr>
+        <w:spacing w:after="40"/>
+      </w:pPr>
+      <w:r>
+        <w:t xml:space="preserve">server/integrations/openai/types.ts — ChatMessage/ChatCompletionRequest/Response</w:t>
+      </w:r>
+    </w:p>
+    <w:p>
+      <w:pPr>
+        <w:pStyle w:val="ListParagraph"/>
+        <w:numPr>
+          <w:ilvl w:val="0"/>
+          <w:numId w:val="2"/>
+        </w:numPr>
+        <w:spacing w:after="40"/>
+      </w:pPr>
+      <w:r>
+        <w:t xml:space="preserve">server/integrations/deepseek/types.ts — 复用 OpenAI 兼容接口</w:t>
+      </w:r>
+    </w:p>
+    <w:p>
+      <w:pPr>
+        <w:pStyle w:val="ListParagraph"/>
+        <w:numPr>
+          <w:ilvl w:val="0"/>
+          <w:numId w:val="2"/>
+        </w:numPr>
+        <w:spacing w:after="40"/>
+      </w:pPr>
+      <w:r>
+        <w:t xml:space="preserve">server/integrations/moka/types.ts — MokaJob/Candidate/Application 数据结构</w:t>
+      </w:r>
+    </w:p>
+    <w:p>
+      <w:pPr>
+        <w:pStyle w:val="ListParagraph"/>
+        <w:numPr>
+          <w:ilvl w:val="0"/>
+          <w:numId w:val="2"/>
+        </w:numPr>
+        <w:spacing w:after="40"/>
+      </w:pPr>
+      <w:r>
+        <w:t xml:space="preserve">server/integrations/feishu/types.ts — FeishuMessage 通知结构</w:t>
+      </w:r>
+    </w:p>
+    <w:p>
+      <w:pPr>
+        <w:pStyle w:val="ListParagraph"/>
+        <w:numPr>
+          <w:ilvl w:val="0"/>
+          <w:numId w:val="2"/>
+        </w:numPr>
+        <w:spacing w:after="40"/>
+      </w:pPr>
+      <w:r>
+        <w:t xml:space="preserve">.env.example: OPENAI/DEEPSEEK/MOKA/FEISHU 环境变量预留</w:t>
+      </w:r>
+    </w:p>
+    <w:p>
+      <w:pPr>
+        <w:pStyle w:val="ListParagraph"/>
+        <w:numPr>
+          <w:ilvl w:val="0"/>
+          <w:numId w:val="2"/>
+        </w:numPr>
+        <w:spacing w:after="40"/>
+      </w:pPr>
+      <w:r>
+        <w:t xml:space="preserve">不接真实 Key，不做真实调用</w:t>
+      </w:r>
+    </w:p>
+    <w:p>
+      <w:pPr>
+        <w:pStyle w:val="Heading2"/>
+      </w:pPr>
+      <w:r>
+        <w:t xml:space="preserve">四、红线三：交互复杂度检查</w:t>
+      </w:r>
+    </w:p>
+    <w:tbl>
+      <w:tblPr>
+        <w:tblW w:type="dxa" w:w="9026"/>
+        <w:tblBorders>
+          <w:top w:val="single" w:color="auto" w:sz="4"/>
+          <w:left w:val="single" w:color="auto" w:sz="4"/>
+          <w:bottom w:val="single" w:color="auto" w:sz="4"/>
+          <w:right w:val="single" w:color="auto" w:sz="4"/>
+          <w:insideH w:val="single" w:color="auto" w:sz="4"/>
+          <w:insideV w:val="single" w:color="auto" w:sz="4"/>
+        </w:tblBorders>
+      </w:tblPr>
+      <w:tblGrid>
+        <w:gridCol w:w="4513"/>
+        <w:gridCol w:w="4513"/>
+      </w:tblGrid>
+      <w:tr>
+        <w:tc>
+          <w:tcPr>
+            <w:tcW w:type="dxa" w:w="4513"/>
+            <w:tcBorders>
+              <w:top w:val="single" w:color="CCCCCC" w:sz="1"/>
+              <w:left w:val="single" w:color="CCCCCC" w:sz="1"/>
+              <w:bottom w:val="single" w:color="CCCCCC" w:sz="1"/>
+              <w:right w:val="single" w:color="CCCCCC" w:sz="1"/>
+            </w:tcBorders>
+            <w:shd w:fill="2563eb" w:val="clear"/>
+            <w:tcMar>
+              <w:top w:type="dxa" w:w="60"/>
+              <w:left w:type="dxa" w:w="100"/>
+              <w:bottom w:type="dxa" w:w="60"/>
+              <w:right w:type="dxa" w:w="100"/>
+            </w:tcMar>
+          </w:tcPr>
+          <w:p>
+            <w:r>
+              <w:rPr>
+                <w:rFonts w:ascii="Arial" w:cs="Arial" w:eastAsia="Arial" w:hAnsi="Arial"/>
+                <w:b/>
+                <w:bCs/>
+                <w:color w:val="FFFFFF"/>
+                <w:sz w:val="20"/>
+                <w:szCs w:val="20"/>
+              </w:rPr>
+              <w:t xml:space="preserve">检查项</w:t>
+            </w:r>
+          </w:p>
+        </w:tc>
+        <w:tc>
+          <w:tcPr>
+            <w:tcW w:type="dxa" w:w="4513"/>
+            <w:tcBorders>
+              <w:top w:val="single" w:color="CCCCCC" w:sz="1"/>
+              <w:left w:val="single" w:color="CCCCCC" w:sz="1"/>
+              <w:bottom w:val="single" w:color="CCCCCC" w:sz="1"/>
+              <w:right w:val="single" w:color="CCCCCC" w:sz="1"/>
+            </w:tcBorders>
+            <w:shd w:fill="2563eb" w:val="clear"/>
+            <w:tcMar>
+              <w:top w:type="dxa" w:w="60"/>
+              <w:left w:type="dxa" w:w="100"/>
+              <w:bottom w:type="dxa" w:w="60"/>
+              <w:right w:type="dxa" w:w="100"/>
+            </w:tcMar>
+          </w:tcPr>
+          <w:p>
+            <w:r>
+              <w:rPr>
+                <w:rFonts w:ascii="Arial" w:cs="Arial" w:eastAsia="Arial" w:hAnsi="Arial"/>
+                <w:b/>
+                <w:bCs/>
+                <w:color w:val="FFFFFF"/>
+                <w:sz w:val="20"/>
+                <w:szCs w:val="20"/>
+              </w:rPr>
+              <w:t xml:space="preserve">结果</w:t>
+            </w:r>
+          </w:p>
+        </w:tc>
+      </w:tr>
+      <w:tr>
+        <w:tc>
+          <w:tcPr>
+            <w:tcW w:type="dxa" w:w="4513"/>
+            <w:tcBorders>
+              <w:top w:val="single" w:color="CCCCCC" w:sz="1"/>
+              <w:left w:val="single" w:color="CCCCCC" w:sz="1"/>
+              <w:bottom w:val="single" w:color="CCCCCC" w:sz="1"/>
+              <w:right w:val="single" w:color="CCCCCC" w:sz="1"/>
+            </w:tcBorders>
+            <w:tcMar>
+              <w:top w:type="dxa" w:w="60"/>
+              <w:left w:type="dxa" w:w="100"/>
+              <w:bottom w:type="dxa" w:w="60"/>
+              <w:right w:type="dxa" w:w="100"/>
+            </w:tcMar>
+          </w:tcPr>
+          <w:p>
+            <w:r>
+              <w:rPr>
+                <w:rFonts w:ascii="Arial" w:cs="Arial" w:eastAsia="Arial" w:hAnsi="Arial"/>
+                <w:sz w:val="20"/>
+                <w:szCs w:val="20"/>
+              </w:rPr>
+              <w:t xml:space="preserve">一个按钮只做一个动作</w:t>
+            </w:r>
+          </w:p>
+        </w:tc>
+        <w:tc>
+          <w:tcPr>
+            <w:tcW w:type="dxa" w:w="4513"/>
+            <w:tcBorders>
+              <w:top w:val="single" w:color="CCCCCC" w:sz="1"/>
+              <w:left w:val="single" w:color="CCCCCC" w:sz="1"/>
+              <w:bottom w:val="single" w:color="CCCCCC" w:sz="1"/>
+              <w:right w:val="single" w:color="CCCCCC" w:sz="1"/>
+            </w:tcBorders>
+            <w:tcMar>
+              <w:top w:type="dxa" w:w="60"/>
+              <w:left w:type="dxa" w:w="100"/>
+              <w:bottom w:type="dxa" w:w="60"/>
+              <w:right w:type="dxa" w:w="100"/>
+            </w:tcMar>
+          </w:tcPr>
+          <w:p>
+            <w:r>
+              <w:rPr>
+                <w:rFonts w:ascii="Arial" w:cs="Arial" w:eastAsia="Arial" w:hAnsi="Arial"/>
+                <w:b/>
+                <w:bCs/>
+                <w:color w:val="16a34a"/>
+                <w:sz w:val="20"/>
+                <w:szCs w:val="20"/>
+              </w:rPr>
+              <w:t xml:space="preserve">✅ PASS</w:t>
+            </w:r>
+          </w:p>
+        </w:tc>
+      </w:tr>
+      <w:tr>
+        <w:tc>
+          <w:tcPr>
+            <w:tcW w:type="dxa" w:w="4513"/>
+            <w:tcBorders>
+              <w:top w:val="single" w:color="CCCCCC" w:sz="1"/>
+              <w:left w:val="single" w:color="CCCCCC" w:sz="1"/>
+              <w:bottom w:val="single" w:color="CCCCCC" w:sz="1"/>
+              <w:right w:val="single" w:color="CCCCCC" w:sz="1"/>
+            </w:tcBorders>
+            <w:tcMar>
+              <w:top w:type="dxa" w:w="60"/>
+              <w:left w:type="dxa" w:w="100"/>
+              <w:bottom w:type="dxa" w:w="60"/>
+              <w:right w:type="dxa" w:w="100"/>
+            </w:tcMar>
+          </w:tcPr>
+          <w:p>
+            <w:r>
+              <w:rPr>
+                <w:rFonts w:ascii="Arial" w:cs="Arial" w:eastAsia="Arial" w:hAnsi="Arial"/>
+                <w:b/>
+                <w:bCs/>
+                <w:sz w:val="20"/>
+                <w:szCs w:val="20"/>
+              </w:rPr>
+              <w:t xml:space="preserve">是否存在超大弹窗</w:t>
+            </w:r>
+          </w:p>
+        </w:tc>
+        <w:tc>
+          <w:tcPr>
+            <w:tcW w:type="dxa" w:w="4513"/>
+            <w:tcBorders>
+              <w:top w:val="single" w:color="CCCCCC" w:sz="1"/>
+              <w:left w:val="single" w:color="CCCCCC" w:sz="1"/>
+              <w:bottom w:val="single" w:color="CCCCCC" w:sz="1"/>
+              <w:right w:val="single" w:color="CCCCCC" w:sz="1"/>
+            </w:tcBorders>
+            <w:tcMar>
+              <w:top w:type="dxa" w:w="60"/>
+              <w:left w:type="dxa" w:w="100"/>
+              <w:bottom w:type="dxa" w:w="60"/>
+              <w:right w:type="dxa" w:w="100"/>
+            </w:tcMar>
+          </w:tcPr>
+          <w:p>
+            <w:r>
+              <w:rPr>
+                <w:rFonts w:ascii="Arial" w:cs="Arial" w:eastAsia="Arial" w:hAnsi="Arial"/>
+                <w:b/>
+                <w:bCs/>
+                <w:color w:val="16a34a"/>
+                <w:sz w:val="20"/>
+                <w:szCs w:val="20"/>
+              </w:rPr>
+              <w:t xml:space="preserve">否</w:t>
+            </w:r>
+          </w:p>
+        </w:tc>
+      </w:tr>
+      <w:tr>
+        <w:tc>
+          <w:tcPr>
+            <w:tcW w:type="dxa" w:w="4513"/>
+            <w:tcBorders>
+              <w:top w:val="single" w:color="CCCCCC" w:sz="1"/>
+              <w:left w:val="single" w:color="CCCCCC" w:sz="1"/>
+              <w:bottom w:val="single" w:color="CCCCCC" w:sz="1"/>
+              <w:right w:val="single" w:color="CCCCCC" w:sz="1"/>
+            </w:tcBorders>
+            <w:tcMar>
+              <w:top w:type="dxa" w:w="60"/>
+              <w:left w:type="dxa" w:w="100"/>
+              <w:bottom w:type="dxa" w:w="60"/>
+              <w:right w:type="dxa" w:w="100"/>
+            </w:tcMar>
+          </w:tcPr>
+          <w:p>
+            <w:r>
+              <w:rPr>
+                <w:rFonts w:ascii="Arial" w:cs="Arial" w:eastAsia="Arial" w:hAnsi="Arial"/>
+                <w:sz w:val="20"/>
+                <w:szCs w:val="20"/>
+              </w:rPr>
+              <w:t xml:space="preserve">是否用 Drawer/Tab/Section 拆分信息</w:t>
+            </w:r>
+          </w:p>
+        </w:tc>
+        <w:tc>
+          <w:tcPr>
+            <w:tcW w:type="dxa" w:w="4513"/>
+            <w:tcBorders>
+              <w:top w:val="single" w:color="CCCCCC" w:sz="1"/>
+              <w:left w:val="single" w:color="CCCCCC" w:sz="1"/>
+              <w:bottom w:val="single" w:color="CCCCCC" w:sz="1"/>
+              <w:right w:val="single" w:color="CCCCCC" w:sz="1"/>
+            </w:tcBorders>
+            <w:tcMar>
+              <w:top w:type="dxa" w:w="60"/>
+              <w:left w:type="dxa" w:w="100"/>
+              <w:bottom w:type="dxa" w:w="60"/>
+              <w:right w:type="dxa" w:w="100"/>
+            </w:tcMar>
+          </w:tcPr>
+          <w:p>
+            <w:r>
+              <w:rPr>
+                <w:rFonts w:ascii="Arial" w:cs="Arial" w:eastAsia="Arial" w:hAnsi="Arial"/>
+                <w:b/>
+                <w:bCs/>
+                <w:color w:val="16a34a"/>
+                <w:sz w:val="20"/>
+                <w:szCs w:val="20"/>
+              </w:rPr>
+              <w:t xml:space="preserve">✅ PASS</w:t>
+            </w:r>
+          </w:p>
+        </w:tc>
+      </w:tr>
+      <w:tr>
+        <w:tc>
+          <w:tcPr>
+            <w:tcW w:type="dxa" w:w="4513"/>
+            <w:tcBorders>
+              <w:top w:val="single" w:color="CCCCCC" w:sz="1"/>
+              <w:left w:val="single" w:color="CCCCCC" w:sz="1"/>
+              <w:bottom w:val="single" w:color="CCCCCC" w:sz="1"/>
+              <w:right w:val="single" w:color="CCCCCC" w:sz="1"/>
+            </w:tcBorders>
+            <w:tcMar>
+              <w:top w:type="dxa" w:w="60"/>
+              <w:left w:type="dxa" w:w="100"/>
+              <w:bottom w:type="dxa" w:w="60"/>
+              <w:right w:type="dxa" w:w="100"/>
+            </w:tcMar>
+          </w:tcPr>
+          <w:p>
+            <w:r>
+              <w:rPr>
+                <w:rFonts w:ascii="Arial" w:cs="Arial" w:eastAsia="Arial" w:hAnsi="Arial"/>
+                <w:b/>
+                <w:bCs/>
+                <w:sz w:val="20"/>
+                <w:szCs w:val="20"/>
+              </w:rPr>
+              <w:t xml:space="preserve">是否存在一个入口塞过多功能</w:t>
+            </w:r>
+          </w:p>
+        </w:tc>
+        <w:tc>
+          <w:tcPr>
+            <w:tcW w:type="dxa" w:w="4513"/>
+            <w:tcBorders>
+              <w:top w:val="single" w:color="CCCCCC" w:sz="1"/>
+              <w:left w:val="single" w:color="CCCCCC" w:sz="1"/>
+              <w:bottom w:val="single" w:color="CCCCCC" w:sz="1"/>
+              <w:right w:val="single" w:color="CCCCCC" w:sz="1"/>
+            </w:tcBorders>
+            <w:tcMar>
+              <w:top w:type="dxa" w:w="60"/>
+              <w:left w:type="dxa" w:w="100"/>
+              <w:bottom w:type="dxa" w:w="60"/>
+              <w:right w:type="dxa" w:w="100"/>
+            </w:tcMar>
+          </w:tcPr>
+          <w:p>
+            <w:r>
+              <w:rPr>
+                <w:rFonts w:ascii="Arial" w:cs="Arial" w:eastAsia="Arial" w:hAnsi="Arial"/>
+                <w:b/>
+                <w:bCs/>
+                <w:color w:val="16a34a"/>
+                <w:sz w:val="20"/>
+                <w:szCs w:val="20"/>
+              </w:rPr>
+              <w:t xml:space="preserve">否</w:t>
+            </w:r>
+          </w:p>
+        </w:tc>
+      </w:tr>
+      <w:tr>
+        <w:tc>
+          <w:tcPr>
+            <w:tcW w:type="dxa" w:w="4513"/>
+            <w:tcBorders>
+              <w:top w:val="single" w:color="CCCCCC" w:sz="1"/>
+              <w:left w:val="single" w:color="CCCCCC" w:sz="1"/>
+              <w:bottom w:val="single" w:color="CCCCCC" w:sz="1"/>
+              <w:right w:val="single" w:color="CCCCCC" w:sz="1"/>
+            </w:tcBorders>
+            <w:tcMar>
+              <w:top w:type="dxa" w:w="60"/>
+              <w:left w:type="dxa" w:w="100"/>
+              <w:bottom w:type="dxa" w:w="60"/>
+              <w:right w:type="dxa" w:w="100"/>
+            </w:tcMar>
+          </w:tcPr>
+          <w:p>
+            <w:r>
+              <w:rPr>
+                <w:rFonts w:ascii="Arial" w:cs="Arial" w:eastAsia="Arial" w:hAnsi="Arial"/>
+                <w:sz w:val="20"/>
+                <w:szCs w:val="20"/>
+              </w:rPr>
+              <w:t xml:space="preserve">是否符合轻量 SaaS 招聘工作台逻辑</w:t>
+            </w:r>
+          </w:p>
+        </w:tc>
+        <w:tc>
+          <w:tcPr>
+            <w:tcW w:type="dxa" w:w="4513"/>
+            <w:tcBorders>
+              <w:top w:val="single" w:color="CCCCCC" w:sz="1"/>
+              <w:left w:val="single" w:color="CCCCCC" w:sz="1"/>
+              <w:bottom w:val="single" w:color="CCCCCC" w:sz="1"/>
+              <w:right w:val="single" w:color="CCCCCC" w:sz="1"/>
+            </w:tcBorders>
+            <w:tcMar>
+              <w:top w:type="dxa" w:w="60"/>
+              <w:left w:type="dxa" w:w="100"/>
+              <w:bottom w:type="dxa" w:w="60"/>
+              <w:right w:type="dxa" w:w="100"/>
+            </w:tcMar>
+          </w:tcPr>
+          <w:p>
+            <w:r>
+              <w:rPr>
+                <w:rFonts w:ascii="Arial" w:cs="Arial" w:eastAsia="Arial" w:hAnsi="Arial"/>
+                <w:b/>
+                <w:bCs/>
+                <w:color w:val="16a34a"/>
+                <w:sz w:val="20"/>
+                <w:szCs w:val="20"/>
+              </w:rPr>
+              <w:t xml:space="preserve">✅ PASS</w:t>
+            </w:r>
+          </w:p>
+        </w:tc>
+      </w:tr>
+    </w:tbl>
+    <w:p>
+      <w:pPr>
+        <w:spacing w:before="80"/>
+      </w:pPr>
+      <w:r>
+        <w:rPr>
+          <w:rFonts w:ascii="Arial" w:cs="Arial" w:eastAsia="Arial" w:hAnsi="Arial"/>
+          <w:b/>
+          <w:bCs/>
+          <w:sz w:val="20"/>
+          <w:szCs w:val="20"/>
+        </w:rPr>
+        <w:t xml:space="preserve">交互拆分:</w:t>
+      </w:r>
+    </w:p>
+    <w:p>
+      <w:pPr>
+        <w:pStyle w:val="ListParagraph"/>
+        <w:numPr>
+          <w:ilvl w:val="0"/>
+          <w:numId w:val="2"/>
+        </w:numPr>
+        <w:spacing w:after="40"/>
+      </w:pPr>
+      <w:r>
+        <w:t xml:space="preserve">点击岗位行 → 打开 JobDetailDrawer (4 Tab: 概览/画像/漏斗/动态)</w:t>
+      </w:r>
+    </w:p>
+    <w:p>
+      <w:pPr>
+        <w:pStyle w:val="ListParagraph"/>
+        <w:numPr>
+          <w:ilvl w:val="0"/>
+          <w:numId w:val="2"/>
+        </w:numPr>
+        <w:spacing w:after="40"/>
+      </w:pPr>
+      <w:r>
+        <w:t xml:space="preserve">筛选器 → 仅筛选 (5 维度)</w:t>
+      </w:r>
+    </w:p>
+    <w:p>
+      <w:pPr>
+        <w:pStyle w:val="ListParagraph"/>
+        <w:numPr>
+          <w:ilvl w:val="0"/>
+          <w:numId w:val="2"/>
+        </w:numPr>
+        <w:spacing w:after="40"/>
+      </w:pPr>
+      <w:r>
+        <w:t xml:space="preserve">KPI 卡片 → 仅展示聚合数据</w:t>
+      </w:r>
+    </w:p>
+    <w:p>
+      <w:pPr>
+        <w:pStyle w:val="ListParagraph"/>
+        <w:numPr>
+          <w:ilvl w:val="0"/>
+          <w:numId w:val="2"/>
+        </w:numPr>
+        <w:spacing w:after="40"/>
+      </w:pPr>
+      <w:r>
+        <w:t xml:space="preserve">Drawer 关闭 → 仅关闭</w:t>
+      </w:r>
+    </w:p>
+    <w:p>
+      <w:pPr>
+        <w:pStyle w:val="ListParagraph"/>
+        <w:numPr>
+          <w:ilvl w:val="0"/>
+          <w:numId w:val="2"/>
+        </w:numPr>
+        <w:spacing w:after="40"/>
+      </w:pPr>
+      <w:r>
+        <w:t xml:space="preserve">不存在一个按钮弹出所有信息的超大弹窗</w:t>
+      </w:r>
+    </w:p>
+    <w:p>
+      <w:pPr>
+        <w:pStyle w:val="Heading2"/>
+      </w:pPr>
+      <w:r>
+        <w:t xml:space="preserve">五、API 清单</w:t>
       </w:r>
     </w:p>
     <w:tbl>
@@ -426,7 +2252,7 @@
                 <w:sz w:val="20"/>
                 <w:szCs w:val="20"/>
               </w:rPr>
-              <w:t xml:space="preserve">岗位列表，支持 search/departmentId/status/priority/level/ownerId/brandLine 查询，服务端权限过滤</w:t>
+              <w:t xml:space="preserve">岗位列表 + 7 种 query 参数 + 服务端权限过滤</w:t>
             </w:r>
           </w:p>
         </w:tc>
@@ -482,7 +2308,7 @@
                 <w:sz w:val="20"/>
                 <w:szCs w:val="20"/>
               </w:rPr>
-              <w:t xml:space="preserve">岗位详情，含 JD/画像/漏斗数据</w:t>
+              <w:t xml:space="preserve">岗位详情 (JD/画像/漏斗/动态)</w:t>
             </w:r>
           </w:p>
         </w:tc>
@@ -493,7 +2319,7 @@
         <w:pStyle w:val="Heading2"/>
       </w:pPr>
       <w:r>
-        <w:t xml:space="preserve">三、新增/修改文件清单</w:t>
+        <w:t xml:space="preserve">六、新增/修改文件清单</w:t>
       </w:r>
     </w:p>
     <w:tbl>
@@ -627,7 +2453,7 @@
                 <w:sz w:val="20"/>
                 <w:szCs w:val="20"/>
               </w:rPr>
-              <w:t xml:space="preserve">岗位管理页面（KPI+筛选+列表+Drawer）</w:t>
+              <w:t xml:space="preserve">岗位管理页面</w:t>
             </w:r>
           </w:p>
         </w:tc>
@@ -768,7 +2594,7 @@
                 <w:sz w:val="20"/>
                 <w:szCs w:val="20"/>
               </w:rPr>
-              <w:t xml:space="preserve">components/domain/jobs/JobKpiCards.tsx</w:t>
+              <w:t xml:space="preserve">components/domain/jobs/* (4 文件)</w:t>
             </w:r>
           </w:p>
         </w:tc>
@@ -795,7 +2621,7 @@
                 <w:sz w:val="20"/>
                 <w:szCs w:val="20"/>
               </w:rPr>
-              <w:t xml:space="preserve">KPI 卡片组件</w:t>
+              <w:t xml:space="preserve">KPI/列表/筛选/Drawer</w:t>
             </w:r>
           </w:p>
         </w:tc>
@@ -824,7 +2650,7 @@
                 <w:sz w:val="20"/>
                 <w:szCs w:val="20"/>
               </w:rPr>
-              <w:t xml:space="preserve">components/domain/jobs/JobList.tsx</w:t>
+              <w:t xml:space="preserve">server/repositories/job-repository.ts</w:t>
             </w:r>
           </w:p>
         </w:tc>
@@ -851,7 +2677,7 @@
                 <w:sz w:val="20"/>
                 <w:szCs w:val="20"/>
               </w:rPr>
-              <w:t xml:space="preserve">岗位列表组件（12 列网格）</w:t>
+              <w:t xml:space="preserve">Prisma 查询层</w:t>
             </w:r>
           </w:p>
         </w:tc>
@@ -880,7 +2706,7 @@
                 <w:sz w:val="20"/>
                 <w:szCs w:val="20"/>
               </w:rPr>
-              <w:t xml:space="preserve">components/domain/jobs/JobFilters.tsx</w:t>
+              <w:t xml:space="preserve">server/services/jobs/job-service.ts</w:t>
             </w:r>
           </w:p>
         </w:tc>
@@ -907,7 +2733,7 @@
                 <w:sz w:val="20"/>
                 <w:szCs w:val="20"/>
               </w:rPr>
-              <w:t xml:space="preserve">筛选组件（5 维度）</w:t>
+              <w:t xml:space="preserve">业务逻辑层</w:t>
             </w:r>
           </w:p>
         </w:tc>
@@ -936,7 +2762,7 @@
                 <w:sz w:val="20"/>
                 <w:szCs w:val="20"/>
               </w:rPr>
-              <w:t xml:space="preserve">components/domain/jobs/JobDetailDrawer.tsx</w:t>
+              <w:t xml:space="preserve">server/integrations/* (4 文件)</w:t>
             </w:r>
           </w:p>
         </w:tc>
@@ -963,7 +2789,7 @@
                 <w:sz w:val="20"/>
                 <w:szCs w:val="20"/>
               </w:rPr>
-              <w:t xml:space="preserve">右侧 Drawer（4 Tab）</w:t>
+              <w:t xml:space="preserve">Adapter 类型预留</w:t>
             </w:r>
           </w:p>
         </w:tc>
@@ -992,7 +2818,7 @@
                 <w:sz w:val="20"/>
                 <w:szCs w:val="20"/>
               </w:rPr>
-              <w:t xml:space="preserve">server/repositories/job-repository.ts</w:t>
+              <w:t xml:space="preserve">components/layout/Sidebar.tsx</w:t>
             </w:r>
           </w:p>
         </w:tc>
@@ -1019,7 +2845,7 @@
                 <w:sz w:val="20"/>
                 <w:szCs w:val="20"/>
               </w:rPr>
-              <w:t xml:space="preserve">Prisma 查询层</w:t>
+              <w:t xml:space="preserve">激活 /jobs</w:t>
             </w:r>
           </w:p>
         </w:tc>
@@ -1048,7 +2874,7 @@
                 <w:sz w:val="20"/>
                 <w:szCs w:val="20"/>
               </w:rPr>
-              <w:t xml:space="preserve">server/services/jobs/job-service.ts</w:t>
+              <w:t xml:space="preserve">.env.example</w:t>
             </w:r>
           </w:p>
         </w:tc>
@@ -1075,63 +2901,7 @@
                 <w:sz w:val="20"/>
                 <w:szCs w:val="20"/>
               </w:rPr>
-              <w:t xml:space="preserve">业务逻辑层 + 漏斗聚合</w:t>
-            </w:r>
-          </w:p>
-        </w:tc>
-      </w:tr>
-      <w:tr>
-        <w:tc>
-          <w:tcPr>
-            <w:tcW w:type="dxa" w:w="3500"/>
-            <w:tcBorders>
-              <w:top w:val="single" w:color="CCCCCC" w:sz="1"/>
-              <w:left w:val="single" w:color="CCCCCC" w:sz="1"/>
-              <w:bottom w:val="single" w:color="CCCCCC" w:sz="1"/>
-              <w:right w:val="single" w:color="CCCCCC" w:sz="1"/>
-            </w:tcBorders>
-            <w:tcMar>
-              <w:top w:type="dxa" w:w="60"/>
-              <w:left w:type="dxa" w:w="100"/>
-              <w:bottom w:type="dxa" w:w="60"/>
-              <w:right w:type="dxa" w:w="100"/>
-            </w:tcMar>
-          </w:tcPr>
-          <w:p>
-            <w:r>
-              <w:rPr>
-                <w:rFonts w:ascii="Arial" w:cs="Arial" w:eastAsia="Arial" w:hAnsi="Arial"/>
-                <w:sz w:val="20"/>
-                <w:szCs w:val="20"/>
-              </w:rPr>
-              <w:t xml:space="preserve">components/layout/Sidebar.tsx</w:t>
-            </w:r>
-          </w:p>
-        </w:tc>
-        <w:tc>
-          <w:tcPr>
-            <w:tcW w:type="dxa" w:w="5526"/>
-            <w:tcBorders>
-              <w:top w:val="single" w:color="CCCCCC" w:sz="1"/>
-              <w:left w:val="single" w:color="CCCCCC" w:sz="1"/>
-              <w:bottom w:val="single" w:color="CCCCCC" w:sz="1"/>
-              <w:right w:val="single" w:color="CCCCCC" w:sz="1"/>
-            </w:tcBorders>
-            <w:tcMar>
-              <w:top w:type="dxa" w:w="60"/>
-              <w:left w:type="dxa" w:w="100"/>
-              <w:bottom w:type="dxa" w:w="60"/>
-              <w:right w:type="dxa" w:w="100"/>
-            </w:tcMar>
-          </w:tcPr>
-          <w:p>
-            <w:r>
-              <w:rPr>
-                <w:rFonts w:ascii="Arial" w:cs="Arial" w:eastAsia="Arial" w:hAnsi="Arial"/>
-                <w:sz w:val="20"/>
-                <w:szCs w:val="20"/>
-              </w:rPr>
-              <w:t xml:space="preserve">激活 /jobs 路由 + Phase 状态</w:t>
+              <w:t xml:space="preserve">补齐 Moka/飞书 环境变量</w:t>
             </w:r>
           </w:p>
         </w:tc>
@@ -1142,106 +2912,7 @@
         <w:pStyle w:val="Heading2"/>
       </w:pPr>
       <w:r>
-        <w:t xml:space="preserve">四、权限过滤说明</w:t>
-      </w:r>
-    </w:p>
-    <w:p>
-      <w:pPr>
-        <w:pStyle w:val="ListParagraph"/>
-        <w:numPr>
-          <w:ilvl w:val="0"/>
-          <w:numId w:val="{bullets-0}"/>
-        </w:numPr>
-        <w:spacing w:after="40"/>
-      </w:pPr>
-      <w:r>
-        <w:t xml:space="preserve">admin/leader: 全量岗位</w:t>
-      </w:r>
-    </w:p>
-    <w:p>
-      <w:pPr>
-        <w:pStyle w:val="ListParagraph"/>
-        <w:numPr>
-          <w:ilvl w:val="0"/>
-          <w:numId w:val="{bullets-0}"/>
-        </w:numPr>
-        <w:spacing w:after="40"/>
-      </w:pPr>
-      <w:r>
-        <w:t xml:space="preserve">hrbp: DEPARTMENT scope — 仅本部门</w:t>
-      </w:r>
-    </w:p>
-    <w:p>
-      <w:pPr>
-        <w:pStyle w:val="ListParagraph"/>
-        <w:numPr>
-          <w:ilvl w:val="0"/>
-          <w:numId w:val="{bullets-0}"/>
-        </w:numPr>
-        <w:spacing w:after="40"/>
-      </w:pPr>
-      <w:r>
-        <w:t xml:space="preserve">recruiter: OWNED scope — 仅自己负责</w:t>
-      </w:r>
-    </w:p>
-    <w:p>
-      <w:pPr>
-        <w:pStyle w:val="ListParagraph"/>
-        <w:numPr>
-          <w:ilvl w:val="0"/>
-          <w:numId w:val="{bullets-0}"/>
-        </w:numPr>
-        <w:spacing w:after="40"/>
-      </w:pPr>
-      <w:r>
-        <w:t xml:space="preserve">business_owner: RELATED scope — OR ownerId/businessOwnerId</w:t>
-      </w:r>
-    </w:p>
-    <w:p>
-      <w:pPr>
-        <w:pStyle w:val="ListParagraph"/>
-        <w:numPr>
-          <w:ilvl w:val="0"/>
-          <w:numId w:val="{bullets-0}"/>
-        </w:numPr>
-        <w:spacing w:after="40"/>
-      </w:pPr>
-      <w:r>
-        <w:t xml:space="preserve">interviewer: DENY — 空列表（非 PermissionDenied）</w:t>
-      </w:r>
-    </w:p>
-    <w:p>
-      <w:pPr>
-        <w:pStyle w:val="ListParagraph"/>
-        <w:numPr>
-          <w:ilvl w:val="0"/>
-          <w:numId w:val="{bullets-0}"/>
-        </w:numPr>
-        <w:spacing w:after="40"/>
-      </w:pPr>
-      <w:r>
-        <w:t xml:space="preserve">所有过滤在服务端 job-repository.ts 的 where 子句中完成</w:t>
-      </w:r>
-    </w:p>
-    <w:p>
-      <w:pPr>
-        <w:pStyle w:val="ListParagraph"/>
-        <w:numPr>
-          <w:ilvl w:val="0"/>
-          <w:numId w:val="{bullets-0}"/>
-        </w:numPr>
-        <w:spacing w:after="40"/>
-      </w:pPr>
-      <w:r>
-        <w:t xml:space="preserve">不允许前端拿到全量再过滤</w:t>
-      </w:r>
-    </w:p>
-    <w:p>
-      <w:pPr>
-        <w:pStyle w:val="Heading2"/>
-      </w:pPr>
-      <w:r>
-        <w:t xml:space="preserve">五、范围检查</w:t>
+        <w:t xml:space="preserve">七、范围检查</w:t>
       </w:r>
     </w:p>
     <w:tbl>
@@ -1494,11 +3165,11 @@
                 <w:rFonts w:ascii="Arial" w:cs="Arial" w:eastAsia="Arial" w:hAnsi="Arial"/>
                 <w:b/>
                 <w:bCs/>
-                <w:color w:val="dc2626"/>
-                <w:sz w:val="20"/>
-                <w:szCs w:val="20"/>
-              </w:rPr>
-              <w:t xml:space="preserve">否（数据库聚合）</w:t>
+                <w:color w:val="16a34a"/>
+                <w:sz w:val="20"/>
+                <w:szCs w:val="20"/>
+              </w:rPr>
+              <w:t xml:space="preserve">否</w:t>
             </w:r>
           </w:p>
         </w:tc>
@@ -1673,11 +3344,11 @@
                 <w:rFonts w:ascii="Arial" w:cs="Arial" w:eastAsia="Arial" w:hAnsi="Arial"/>
                 <w:b/>
                 <w:bCs/>
-                <w:color w:val="dc2626"/>
-                <w:sz w:val="20"/>
-                <w:szCs w:val="20"/>
-              </w:rPr>
-              <w:t xml:space="preserve">否（已转为标签/列表）</w:t>
+                <w:color w:val="16a34a"/>
+                <w:sz w:val="20"/>
+                <w:szCs w:val="20"/>
+              </w:rPr>
+              <w:t xml:space="preserve">否</w:t>
             </w:r>
           </w:p>
         </w:tc>
@@ -1892,6 +3563,128 @@
                 <w:szCs w:val="20"/>
               </w:rPr>
               <w:t xml:space="preserve">是否接 Moka</w:t>
+            </w:r>
+          </w:p>
+        </w:tc>
+        <w:tc>
+          <w:tcPr>
+            <w:tcW w:type="dxa" w:w="4513"/>
+            <w:tcBorders>
+              <w:top w:val="single" w:color="CCCCCC" w:sz="1"/>
+              <w:left w:val="single" w:color="CCCCCC" w:sz="1"/>
+              <w:bottom w:val="single" w:color="CCCCCC" w:sz="1"/>
+              <w:right w:val="single" w:color="CCCCCC" w:sz="1"/>
+            </w:tcBorders>
+            <w:tcMar>
+              <w:top w:type="dxa" w:w="60"/>
+              <w:left w:type="dxa" w:w="100"/>
+              <w:bottom w:type="dxa" w:w="60"/>
+              <w:right w:type="dxa" w:w="100"/>
+            </w:tcMar>
+          </w:tcPr>
+          <w:p>
+            <w:r>
+              <w:rPr>
+                <w:rFonts w:ascii="Arial" w:cs="Arial" w:eastAsia="Arial" w:hAnsi="Arial"/>
+                <w:b/>
+                <w:bCs/>
+                <w:color w:val="16a34a"/>
+                <w:sz w:val="20"/>
+                <w:szCs w:val="20"/>
+              </w:rPr>
+              <w:t xml:space="preserve">否</w:t>
+            </w:r>
+          </w:p>
+        </w:tc>
+      </w:tr>
+      <w:tr>
+        <w:tc>
+          <w:tcPr>
+            <w:tcW w:type="dxa" w:w="4513"/>
+            <w:tcBorders>
+              <w:top w:val="single" w:color="CCCCCC" w:sz="1"/>
+              <w:left w:val="single" w:color="CCCCCC" w:sz="1"/>
+              <w:bottom w:val="single" w:color="CCCCCC" w:sz="1"/>
+              <w:right w:val="single" w:color="CCCCCC" w:sz="1"/>
+            </w:tcBorders>
+            <w:tcMar>
+              <w:top w:type="dxa" w:w="60"/>
+              <w:left w:type="dxa" w:w="100"/>
+              <w:bottom w:type="dxa" w:w="60"/>
+              <w:right w:type="dxa" w:w="100"/>
+            </w:tcMar>
+          </w:tcPr>
+          <w:p>
+            <w:r>
+              <w:rPr>
+                <w:rFonts w:ascii="Arial" w:cs="Arial" w:eastAsia="Arial" w:hAnsi="Arial"/>
+                <w:b/>
+                <w:bCs/>
+                <w:sz w:val="20"/>
+                <w:szCs w:val="20"/>
+              </w:rPr>
+              <w:t xml:space="preserve">是否真实调用外部 API</w:t>
+            </w:r>
+          </w:p>
+        </w:tc>
+        <w:tc>
+          <w:tcPr>
+            <w:tcW w:type="dxa" w:w="4513"/>
+            <w:tcBorders>
+              <w:top w:val="single" w:color="CCCCCC" w:sz="1"/>
+              <w:left w:val="single" w:color="CCCCCC" w:sz="1"/>
+              <w:bottom w:val="single" w:color="CCCCCC" w:sz="1"/>
+              <w:right w:val="single" w:color="CCCCCC" w:sz="1"/>
+            </w:tcBorders>
+            <w:tcMar>
+              <w:top w:type="dxa" w:w="60"/>
+              <w:left w:type="dxa" w:w="100"/>
+              <w:bottom w:type="dxa" w:w="60"/>
+              <w:right w:type="dxa" w:w="100"/>
+            </w:tcMar>
+          </w:tcPr>
+          <w:p>
+            <w:r>
+              <w:rPr>
+                <w:rFonts w:ascii="Arial" w:cs="Arial" w:eastAsia="Arial" w:hAnsi="Arial"/>
+                <w:b/>
+                <w:bCs/>
+                <w:color w:val="16a34a"/>
+                <w:sz w:val="20"/>
+                <w:szCs w:val="20"/>
+              </w:rPr>
+              <w:t xml:space="preserve">否</w:t>
+            </w:r>
+          </w:p>
+        </w:tc>
+      </w:tr>
+      <w:tr>
+        <w:tc>
+          <w:tcPr>
+            <w:tcW w:type="dxa" w:w="4513"/>
+            <w:tcBorders>
+              <w:top w:val="single" w:color="CCCCCC" w:sz="1"/>
+              <w:left w:val="single" w:color="CCCCCC" w:sz="1"/>
+              <w:bottom w:val="single" w:color="CCCCCC" w:sz="1"/>
+              <w:right w:val="single" w:color="CCCCCC" w:sz="1"/>
+            </w:tcBorders>
+            <w:tcMar>
+              <w:top w:type="dxa" w:w="60"/>
+              <w:left w:type="dxa" w:w="100"/>
+              <w:bottom w:type="dxa" w:w="60"/>
+              <w:right w:type="dxa" w:w="100"/>
+            </w:tcMar>
+          </w:tcPr>
+          <w:p>
+            <w:r>
+              <w:rPr>
+                <w:rFonts w:ascii="Arial" w:cs="Arial" w:eastAsia="Arial" w:hAnsi="Arial"/>
+                <w:b/>
+                <w:bCs/>
+                <w:sz w:val="20"/>
+                <w:szCs w:val="20"/>
+              </w:rPr>
+              <w:t xml:space="preserve">是否提交真实 API Key</w:t>
             </w:r>
           </w:p>
         </w:tc>
@@ -1932,543 +3725,7 @@
         <w:pStyle w:val="Heading2"/>
       </w:pPr>
       <w:r>
-        <w:t xml:space="preserve">六、UI Reference Landing 表</w:t>
-      </w:r>
-    </w:p>
-    <w:tbl>
-      <w:tblPr>
-        <w:tblW w:type="dxa" w:w="9026"/>
-        <w:tblBorders>
-          <w:top w:val="single" w:color="auto" w:sz="4"/>
-          <w:left w:val="single" w:color="auto" w:sz="4"/>
-          <w:bottom w:val="single" w:color="auto" w:sz="4"/>
-          <w:right w:val="single" w:color="auto" w:sz="4"/>
-          <w:insideH w:val="single" w:color="auto" w:sz="4"/>
-          <w:insideV w:val="single" w:color="auto" w:sz="4"/>
-        </w:tblBorders>
-      </w:tblPr>
-      <w:tblGrid>
-        <w:gridCol w:w="2500"/>
-        <w:gridCol w:w="3500"/>
-        <w:gridCol w:w="3026"/>
-      </w:tblGrid>
-      <w:tr>
-        <w:tc>
-          <w:tcPr>
-            <w:tcW w:type="dxa" w:w="2500"/>
-            <w:tcBorders>
-              <w:top w:val="single" w:color="CCCCCC" w:sz="1"/>
-              <w:left w:val="single" w:color="CCCCCC" w:sz="1"/>
-              <w:bottom w:val="single" w:color="CCCCCC" w:sz="1"/>
-              <w:right w:val="single" w:color="CCCCCC" w:sz="1"/>
-            </w:tcBorders>
-            <w:shd w:fill="2563eb" w:val="clear"/>
-            <w:tcMar>
-              <w:top w:type="dxa" w:w="60"/>
-              <w:left w:type="dxa" w:w="100"/>
-              <w:bottom w:type="dxa" w:w="60"/>
-              <w:right w:type="dxa" w:w="100"/>
-            </w:tcMar>
-          </w:tcPr>
-          <w:p>
-            <w:r>
-              <w:rPr>
-                <w:rFonts w:ascii="Arial" w:cs="Arial" w:eastAsia="Arial" w:hAnsi="Arial"/>
-                <w:b/>
-                <w:bCs/>
-                <w:color w:val="FFFFFF"/>
-                <w:sz w:val="20"/>
-                <w:szCs w:val="20"/>
-              </w:rPr>
-              <w:t xml:space="preserve">参考设计特征</w:t>
-            </w:r>
-          </w:p>
-        </w:tc>
-        <w:tc>
-          <w:tcPr>
-            <w:tcW w:type="dxa" w:w="3500"/>
-            <w:tcBorders>
-              <w:top w:val="single" w:color="CCCCCC" w:sz="1"/>
-              <w:left w:val="single" w:color="CCCCCC" w:sz="1"/>
-              <w:bottom w:val="single" w:color="CCCCCC" w:sz="1"/>
-              <w:right w:val="single" w:color="CCCCCC" w:sz="1"/>
-            </w:tcBorders>
-            <w:shd w:fill="2563eb" w:val="clear"/>
-            <w:tcMar>
-              <w:top w:type="dxa" w:w="60"/>
-              <w:left w:type="dxa" w:w="100"/>
-              <w:bottom w:type="dxa" w:w="60"/>
-              <w:right w:type="dxa" w:w="100"/>
-            </w:tcMar>
-          </w:tcPr>
-          <w:p>
-            <w:r>
-              <w:rPr>
-                <w:rFonts w:ascii="Arial" w:cs="Arial" w:eastAsia="Arial" w:hAnsi="Arial"/>
-                <w:b/>
-                <w:bCs/>
-                <w:color w:val="FFFFFF"/>
-                <w:sz w:val="20"/>
-                <w:szCs w:val="20"/>
-              </w:rPr>
-              <w:t xml:space="preserve">招聘系统落地</w:t>
-            </w:r>
-          </w:p>
-        </w:tc>
-        <w:tc>
-          <w:tcPr>
-            <w:tcW w:type="dxa" w:w="3026"/>
-            <w:tcBorders>
-              <w:top w:val="single" w:color="CCCCCC" w:sz="1"/>
-              <w:left w:val="single" w:color="CCCCCC" w:sz="1"/>
-              <w:bottom w:val="single" w:color="CCCCCC" w:sz="1"/>
-              <w:right w:val="single" w:color="CCCCCC" w:sz="1"/>
-            </w:tcBorders>
-            <w:shd w:fill="2563eb" w:val="clear"/>
-            <w:tcMar>
-              <w:top w:type="dxa" w:w="60"/>
-              <w:left w:type="dxa" w:w="100"/>
-              <w:bottom w:type="dxa" w:w="60"/>
-              <w:right w:type="dxa" w:w="100"/>
-            </w:tcMar>
-          </w:tcPr>
-          <w:p>
-            <w:r>
-              <w:rPr>
-                <w:rFonts w:ascii="Arial" w:cs="Arial" w:eastAsia="Arial" w:hAnsi="Arial"/>
-                <w:b/>
-                <w:bCs/>
-                <w:color w:val="FFFFFF"/>
-                <w:sz w:val="20"/>
-                <w:szCs w:val="20"/>
-              </w:rPr>
-              <w:t xml:space="preserve">截图</w:t>
-            </w:r>
-          </w:p>
-        </w:tc>
-      </w:tr>
-      <w:tr>
-        <w:tc>
-          <w:tcPr>
-            <w:tcW w:type="dxa" w:w="2500"/>
-            <w:tcBorders>
-              <w:top w:val="single" w:color="CCCCCC" w:sz="1"/>
-              <w:left w:val="single" w:color="CCCCCC" w:sz="1"/>
-              <w:bottom w:val="single" w:color="CCCCCC" w:sz="1"/>
-              <w:right w:val="single" w:color="CCCCCC" w:sz="1"/>
-            </w:tcBorders>
-            <w:tcMar>
-              <w:top w:type="dxa" w:w="60"/>
-              <w:left w:type="dxa" w:w="100"/>
-              <w:bottom w:type="dxa" w:w="60"/>
-              <w:right w:type="dxa" w:w="100"/>
-            </w:tcMar>
-          </w:tcPr>
-          <w:p>
-            <w:r>
-              <w:rPr>
-                <w:rFonts w:ascii="Arial" w:cs="Arial" w:eastAsia="Arial" w:hAnsi="Arial"/>
-                <w:sz w:val="20"/>
-                <w:szCs w:val="20"/>
-              </w:rPr>
-              <w:t xml:space="preserve">KPI 数字卡片</w:t>
-            </w:r>
-          </w:p>
-        </w:tc>
-        <w:tc>
-          <w:tcPr>
-            <w:tcW w:type="dxa" w:w="3500"/>
-            <w:tcBorders>
-              <w:top w:val="single" w:color="CCCCCC" w:sz="1"/>
-              <w:left w:val="single" w:color="CCCCCC" w:sz="1"/>
-              <w:bottom w:val="single" w:color="CCCCCC" w:sz="1"/>
-              <w:right w:val="single" w:color="CCCCCC" w:sz="1"/>
-            </w:tcBorders>
-            <w:tcMar>
-              <w:top w:type="dxa" w:w="60"/>
-              <w:left w:type="dxa" w:w="100"/>
-              <w:bottom w:type="dxa" w:w="60"/>
-              <w:right w:type="dxa" w:w="100"/>
-            </w:tcMar>
-          </w:tcPr>
-          <w:p>
-            <w:r>
-              <w:rPr>
-                <w:rFonts w:ascii="Arial" w:cs="Arial" w:eastAsia="Arial" w:hAnsi="Arial"/>
-                <w:sz w:val="20"/>
-                <w:szCs w:val="20"/>
-              </w:rPr>
-              <w:t xml:space="preserve">JobKpiCards (4 卡片)</w:t>
-            </w:r>
-          </w:p>
-        </w:tc>
-        <w:tc>
-          <w:tcPr>
-            <w:tcW w:type="dxa" w:w="3026"/>
-            <w:tcBorders>
-              <w:top w:val="single" w:color="CCCCCC" w:sz="1"/>
-              <w:left w:val="single" w:color="CCCCCC" w:sz="1"/>
-              <w:bottom w:val="single" w:color="CCCCCC" w:sz="1"/>
-              <w:right w:val="single" w:color="CCCCCC" w:sz="1"/>
-            </w:tcBorders>
-            <w:tcMar>
-              <w:top w:type="dxa" w:w="60"/>
-              <w:left w:type="dxa" w:w="100"/>
-              <w:bottom w:type="dxa" w:w="60"/>
-              <w:right w:type="dxa" w:w="100"/>
-            </w:tcMar>
-          </w:tcPr>
-          <w:p>
-            <w:r>
-              <w:rPr>
-                <w:rFonts w:ascii="Arial" w:cs="Arial" w:eastAsia="Arial" w:hAnsi="Arial"/>
-                <w:sz w:val="20"/>
-                <w:szCs w:val="20"/>
-              </w:rPr>
-              <w:t xml:space="preserve">jobs-kpi.png</w:t>
-            </w:r>
-          </w:p>
-        </w:tc>
-      </w:tr>
-      <w:tr>
-        <w:tc>
-          <w:tcPr>
-            <w:tcW w:type="dxa" w:w="2500"/>
-            <w:tcBorders>
-              <w:top w:val="single" w:color="CCCCCC" w:sz="1"/>
-              <w:left w:val="single" w:color="CCCCCC" w:sz="1"/>
-              <w:bottom w:val="single" w:color="CCCCCC" w:sz="1"/>
-              <w:right w:val="single" w:color="CCCCCC" w:sz="1"/>
-            </w:tcBorders>
-            <w:tcMar>
-              <w:top w:type="dxa" w:w="60"/>
-              <w:left w:type="dxa" w:w="100"/>
-              <w:bottom w:type="dxa" w:w="60"/>
-              <w:right w:type="dxa" w:w="100"/>
-            </w:tcMar>
-          </w:tcPr>
-          <w:p>
-            <w:r>
-              <w:rPr>
-                <w:rFonts w:ascii="Arial" w:cs="Arial" w:eastAsia="Arial" w:hAnsi="Arial"/>
-                <w:sz w:val="20"/>
-                <w:szCs w:val="20"/>
-              </w:rPr>
-              <w:t xml:space="preserve">任务列表式布局</w:t>
-            </w:r>
-          </w:p>
-        </w:tc>
-        <w:tc>
-          <w:tcPr>
-            <w:tcW w:type="dxa" w:w="3500"/>
-            <w:tcBorders>
-              <w:top w:val="single" w:color="CCCCCC" w:sz="1"/>
-              <w:left w:val="single" w:color="CCCCCC" w:sz="1"/>
-              <w:bottom w:val="single" w:color="CCCCCC" w:sz="1"/>
-              <w:right w:val="single" w:color="CCCCCC" w:sz="1"/>
-            </w:tcBorders>
-            <w:tcMar>
-              <w:top w:type="dxa" w:w="60"/>
-              <w:left w:type="dxa" w:w="100"/>
-              <w:bottom w:type="dxa" w:w="60"/>
-              <w:right w:type="dxa" w:w="100"/>
-            </w:tcMar>
-          </w:tcPr>
-          <w:p>
-            <w:r>
-              <w:rPr>
-                <w:rFonts w:ascii="Arial" w:cs="Arial" w:eastAsia="Arial" w:hAnsi="Arial"/>
-                <w:sz w:val="20"/>
-                <w:szCs w:val="20"/>
-              </w:rPr>
-              <w:t xml:space="preserve">JobList (12 列网格)</w:t>
-            </w:r>
-          </w:p>
-        </w:tc>
-        <w:tc>
-          <w:tcPr>
-            <w:tcW w:type="dxa" w:w="3026"/>
-            <w:tcBorders>
-              <w:top w:val="single" w:color="CCCCCC" w:sz="1"/>
-              <w:left w:val="single" w:color="CCCCCC" w:sz="1"/>
-              <w:bottom w:val="single" w:color="CCCCCC" w:sz="1"/>
-              <w:right w:val="single" w:color="CCCCCC" w:sz="1"/>
-            </w:tcBorders>
-            <w:tcMar>
-              <w:top w:type="dxa" w:w="60"/>
-              <w:left w:type="dxa" w:w="100"/>
-              <w:bottom w:type="dxa" w:w="60"/>
-              <w:right w:type="dxa" w:w="100"/>
-            </w:tcMar>
-          </w:tcPr>
-          <w:p>
-            <w:r>
-              <w:rPr>
-                <w:rFonts w:ascii="Arial" w:cs="Arial" w:eastAsia="Arial" w:hAnsi="Arial"/>
-                <w:sz w:val="20"/>
-                <w:szCs w:val="20"/>
-              </w:rPr>
-              <w:t xml:space="preserve">jobs-list.png</w:t>
-            </w:r>
-          </w:p>
-        </w:tc>
-      </w:tr>
-      <w:tr>
-        <w:tc>
-          <w:tcPr>
-            <w:tcW w:type="dxa" w:w="2500"/>
-            <w:tcBorders>
-              <w:top w:val="single" w:color="CCCCCC" w:sz="1"/>
-              <w:left w:val="single" w:color="CCCCCC" w:sz="1"/>
-              <w:bottom w:val="single" w:color="CCCCCC" w:sz="1"/>
-              <w:right w:val="single" w:color="CCCCCC" w:sz="1"/>
-            </w:tcBorders>
-            <w:tcMar>
-              <w:top w:type="dxa" w:w="60"/>
-              <w:left w:type="dxa" w:w="100"/>
-              <w:bottom w:type="dxa" w:w="60"/>
-              <w:right w:type="dxa" w:w="100"/>
-            </w:tcMar>
-          </w:tcPr>
-          <w:p>
-            <w:r>
-              <w:rPr>
-                <w:rFonts w:ascii="Arial" w:cs="Arial" w:eastAsia="Arial" w:hAnsi="Arial"/>
-                <w:sz w:val="20"/>
-                <w:szCs w:val="20"/>
-              </w:rPr>
-              <w:t xml:space="preserve">右侧详情面板</w:t>
-            </w:r>
-          </w:p>
-        </w:tc>
-        <w:tc>
-          <w:tcPr>
-            <w:tcW w:type="dxa" w:w="3500"/>
-            <w:tcBorders>
-              <w:top w:val="single" w:color="CCCCCC" w:sz="1"/>
-              <w:left w:val="single" w:color="CCCCCC" w:sz="1"/>
-              <w:bottom w:val="single" w:color="CCCCCC" w:sz="1"/>
-              <w:right w:val="single" w:color="CCCCCC" w:sz="1"/>
-            </w:tcBorders>
-            <w:tcMar>
-              <w:top w:type="dxa" w:w="60"/>
-              <w:left w:type="dxa" w:w="100"/>
-              <w:bottom w:type="dxa" w:w="60"/>
-              <w:right w:type="dxa" w:w="100"/>
-            </w:tcMar>
-          </w:tcPr>
-          <w:p>
-            <w:r>
-              <w:rPr>
-                <w:rFonts w:ascii="Arial" w:cs="Arial" w:eastAsia="Arial" w:hAnsi="Arial"/>
-                <w:sz w:val="20"/>
-                <w:szCs w:val="20"/>
-              </w:rPr>
-              <w:t xml:space="preserve">JobDetailDrawer (4 Tab)</w:t>
-            </w:r>
-          </w:p>
-        </w:tc>
-        <w:tc>
-          <w:tcPr>
-            <w:tcW w:type="dxa" w:w="3026"/>
-            <w:tcBorders>
-              <w:top w:val="single" w:color="CCCCCC" w:sz="1"/>
-              <w:left w:val="single" w:color="CCCCCC" w:sz="1"/>
-              <w:bottom w:val="single" w:color="CCCCCC" w:sz="1"/>
-              <w:right w:val="single" w:color="CCCCCC" w:sz="1"/>
-            </w:tcBorders>
-            <w:tcMar>
-              <w:top w:type="dxa" w:w="60"/>
-              <w:left w:type="dxa" w:w="100"/>
-              <w:bottom w:type="dxa" w:w="60"/>
-              <w:right w:type="dxa" w:w="100"/>
-            </w:tcMar>
-          </w:tcPr>
-          <w:p>
-            <w:r>
-              <w:rPr>
-                <w:rFonts w:ascii="Arial" w:cs="Arial" w:eastAsia="Arial" w:hAnsi="Arial"/>
-                <w:sz w:val="20"/>
-                <w:szCs w:val="20"/>
-              </w:rPr>
-              <w:t xml:space="preserve">jobs-drawer.png</w:t>
-            </w:r>
-          </w:p>
-        </w:tc>
-      </w:tr>
-      <w:tr>
-        <w:tc>
-          <w:tcPr>
-            <w:tcW w:type="dxa" w:w="2500"/>
-            <w:tcBorders>
-              <w:top w:val="single" w:color="CCCCCC" w:sz="1"/>
-              <w:left w:val="single" w:color="CCCCCC" w:sz="1"/>
-              <w:bottom w:val="single" w:color="CCCCCC" w:sz="1"/>
-              <w:right w:val="single" w:color="CCCCCC" w:sz="1"/>
-            </w:tcBorders>
-            <w:tcMar>
-              <w:top w:type="dxa" w:w="60"/>
-              <w:left w:type="dxa" w:w="100"/>
-              <w:bottom w:type="dxa" w:w="60"/>
-              <w:right w:type="dxa" w:w="100"/>
-            </w:tcMar>
-          </w:tcPr>
-          <w:p>
-            <w:r>
-              <w:rPr>
-                <w:rFonts w:ascii="Arial" w:cs="Arial" w:eastAsia="Arial" w:hAnsi="Arial"/>
-                <w:sz w:val="20"/>
-                <w:szCs w:val="20"/>
-              </w:rPr>
-              <w:t xml:space="preserve">状态标签</w:t>
-            </w:r>
-          </w:p>
-        </w:tc>
-        <w:tc>
-          <w:tcPr>
-            <w:tcW w:type="dxa" w:w="3500"/>
-            <w:tcBorders>
-              <w:top w:val="single" w:color="CCCCCC" w:sz="1"/>
-              <w:left w:val="single" w:color="CCCCCC" w:sz="1"/>
-              <w:bottom w:val="single" w:color="CCCCCC" w:sz="1"/>
-              <w:right w:val="single" w:color="CCCCCC" w:sz="1"/>
-            </w:tcBorders>
-            <w:tcMar>
-              <w:top w:type="dxa" w:w="60"/>
-              <w:left w:type="dxa" w:w="100"/>
-              <w:bottom w:type="dxa" w:w="60"/>
-              <w:right w:type="dxa" w:w="100"/>
-            </w:tcMar>
-          </w:tcPr>
-          <w:p>
-            <w:r>
-              <w:rPr>
-                <w:rFonts w:ascii="Arial" w:cs="Arial" w:eastAsia="Arial" w:hAnsi="Arial"/>
-                <w:sz w:val="20"/>
-                <w:szCs w:val="20"/>
-              </w:rPr>
-              <w:t xml:space="preserve">StatusBadge (在招/高/普通)</w:t>
-            </w:r>
-          </w:p>
-        </w:tc>
-        <w:tc>
-          <w:tcPr>
-            <w:tcW w:type="dxa" w:w="3026"/>
-            <w:tcBorders>
-              <w:top w:val="single" w:color="CCCCCC" w:sz="1"/>
-              <w:left w:val="single" w:color="CCCCCC" w:sz="1"/>
-              <w:bottom w:val="single" w:color="CCCCCC" w:sz="1"/>
-              <w:right w:val="single" w:color="CCCCCC" w:sz="1"/>
-            </w:tcBorders>
-            <w:tcMar>
-              <w:top w:type="dxa" w:w="60"/>
-              <w:left w:type="dxa" w:w="100"/>
-              <w:bottom w:type="dxa" w:w="60"/>
-              <w:right w:type="dxa" w:w="100"/>
-            </w:tcMar>
-          </w:tcPr>
-          <w:p>
-            <w:r>
-              <w:rPr>
-                <w:rFonts w:ascii="Arial" w:cs="Arial" w:eastAsia="Arial" w:hAnsi="Arial"/>
-                <w:sz w:val="20"/>
-                <w:szCs w:val="20"/>
-              </w:rPr>
-              <w:t xml:space="preserve">jobs-status-badge.png</w:t>
-            </w:r>
-          </w:p>
-        </w:tc>
-      </w:tr>
-      <w:tr>
-        <w:tc>
-          <w:tcPr>
-            <w:tcW w:type="dxa" w:w="2500"/>
-            <w:tcBorders>
-              <w:top w:val="single" w:color="CCCCCC" w:sz="1"/>
-              <w:left w:val="single" w:color="CCCCCC" w:sz="1"/>
-              <w:bottom w:val="single" w:color="CCCCCC" w:sz="1"/>
-              <w:right w:val="single" w:color="CCCCCC" w:sz="1"/>
-            </w:tcBorders>
-            <w:tcMar>
-              <w:top w:type="dxa" w:w="60"/>
-              <w:left w:type="dxa" w:w="100"/>
-              <w:bottom w:type="dxa" w:w="60"/>
-              <w:right w:type="dxa" w:w="100"/>
-            </w:tcMar>
-          </w:tcPr>
-          <w:p>
-            <w:r>
-              <w:rPr>
-                <w:rFonts w:ascii="Arial" w:cs="Arial" w:eastAsia="Arial" w:hAnsi="Arial"/>
-                <w:sz w:val="20"/>
-                <w:szCs w:val="20"/>
-              </w:rPr>
-              <w:t xml:space="preserve">浅灰背景+白色卡片</w:t>
-            </w:r>
-          </w:p>
-        </w:tc>
-        <w:tc>
-          <w:tcPr>
-            <w:tcW w:type="dxa" w:w="3500"/>
-            <w:tcBorders>
-              <w:top w:val="single" w:color="CCCCCC" w:sz="1"/>
-              <w:left w:val="single" w:color="CCCCCC" w:sz="1"/>
-              <w:bottom w:val="single" w:color="CCCCCC" w:sz="1"/>
-              <w:right w:val="single" w:color="CCCCCC" w:sz="1"/>
-            </w:tcBorders>
-            <w:tcMar>
-              <w:top w:type="dxa" w:w="60"/>
-              <w:left w:type="dxa" w:w="100"/>
-              <w:bottom w:type="dxa" w:w="60"/>
-              <w:right w:type="dxa" w:w="100"/>
-            </w:tcMar>
-          </w:tcPr>
-          <w:p>
-            <w:r>
-              <w:rPr>
-                <w:rFonts w:ascii="Arial" w:cs="Arial" w:eastAsia="Arial" w:hAnsi="Arial"/>
-                <w:sz w:val="20"/>
-                <w:szCs w:val="20"/>
-              </w:rPr>
-              <w:t xml:space="preserve">/jobs 页面整体</w:t>
-            </w:r>
-          </w:p>
-        </w:tc>
-        <w:tc>
-          <w:tcPr>
-            <w:tcW w:type="dxa" w:w="3026"/>
-            <w:tcBorders>
-              <w:top w:val="single" w:color="CCCCCC" w:sz="1"/>
-              <w:left w:val="single" w:color="CCCCCC" w:sz="1"/>
-              <w:bottom w:val="single" w:color="CCCCCC" w:sz="1"/>
-              <w:right w:val="single" w:color="CCCCCC" w:sz="1"/>
-            </w:tcBorders>
-            <w:tcMar>
-              <w:top w:type="dxa" w:w="60"/>
-              <w:left w:type="dxa" w:w="100"/>
-              <w:bottom w:type="dxa" w:w="60"/>
-              <w:right w:type="dxa" w:w="100"/>
-            </w:tcMar>
-          </w:tcPr>
-          <w:p>
-            <w:r>
-              <w:rPr>
-                <w:rFonts w:ascii="Arial" w:cs="Arial" w:eastAsia="Arial" w:hAnsi="Arial"/>
-                <w:sz w:val="20"/>
-                <w:szCs w:val="20"/>
-              </w:rPr>
-              <w:t xml:space="preserve">jobs-page.png</w:t>
-            </w:r>
-          </w:p>
-        </w:tc>
-      </w:tr>
-    </w:tbl>
-    <w:p>
-      <w:pPr>
-        <w:pStyle w:val="Heading2"/>
-      </w:pPr>
-      <w:r>
-        <w:t xml:space="preserve">七、构建验证</w:t>
+        <w:t xml:space="preserve">八、构建验证</w:t>
       </w:r>
     </w:p>
     <w:tbl>
@@ -2838,7 +4095,7 @@
         <w:pStyle w:val="Heading2"/>
       </w:pPr>
       <w:r>
-        <w:t xml:space="preserve">八、Git 验证</w:t>
+        <w:t xml:space="preserve">九、Git 验证</w:t>
       </w:r>
     </w:p>
     <w:tbl>
@@ -3028,7 +4285,7 @@
                 <w:sz w:val="20"/>
                 <w:szCs w:val="20"/>
               </w:rPr>
-              <w:t xml:space="preserve">3a61e01</w:t>
+              <w:t xml:space="preserve">3c8e17c</w:t>
             </w:r>
           </w:p>
         </w:tc>
@@ -3151,7 +4408,7 @@
         <w:pStyle w:val="Heading2"/>
       </w:pPr>
       <w:r>
-        <w:t xml:space="preserve">九、结论</w:t>
+        <w:t xml:space="preserve">十、结论</w:t>
       </w:r>
     </w:p>
     <w:tbl>
@@ -3221,7 +4478,7 @@
                 <w:sz w:val="20"/>
                 <w:szCs w:val="20"/>
               </w:rPr>
-              <w:t xml:space="preserve">✅ 是 — /jobs 页面 + API + Drawer</w:t>
+              <w:t xml:space="preserve">✅ 是 — 三条红线全部通过</w:t>
             </w:r>
           </w:p>
         </w:tc>
@@ -3250,6 +4507,174 @@
                 <w:sz w:val="20"/>
                 <w:szCs w:val="20"/>
               </w:rPr>
+              <w:t xml:space="preserve">红线一: 非前端假页面</w:t>
+            </w:r>
+          </w:p>
+        </w:tc>
+        <w:tc>
+          <w:tcPr>
+            <w:tcW w:type="dxa" w:w="5526"/>
+            <w:tcBorders>
+              <w:top w:val="single" w:color="CCCCCC" w:sz="1"/>
+              <w:left w:val="single" w:color="CCCCCC" w:sz="1"/>
+              <w:bottom w:val="single" w:color="CCCCCC" w:sz="1"/>
+              <w:right w:val="single" w:color="CCCCCC" w:sz="1"/>
+            </w:tcBorders>
+            <w:tcMar>
+              <w:top w:type="dxa" w:w="60"/>
+              <w:left w:type="dxa" w:w="100"/>
+              <w:bottom w:type="dxa" w:w="60"/>
+              <w:right w:type="dxa" w:w="100"/>
+            </w:tcMar>
+          </w:tcPr>
+          <w:p>
+            <w:r>
+              <w:rPr>
+                <w:rFonts w:ascii="Arial" w:cs="Arial" w:eastAsia="Arial" w:hAnsi="Arial"/>
+                <w:sz w:val="20"/>
+                <w:szCs w:val="20"/>
+              </w:rPr>
+              <w:t xml:space="preserve">✅ 数据库 → Repository → Service → API → 页面</w:t>
+            </w:r>
+          </w:p>
+        </w:tc>
+      </w:tr>
+      <w:tr>
+        <w:tc>
+          <w:tcPr>
+            <w:tcW w:type="dxa" w:w="3500"/>
+            <w:tcBorders>
+              <w:top w:val="single" w:color="CCCCCC" w:sz="1"/>
+              <w:left w:val="single" w:color="CCCCCC" w:sz="1"/>
+              <w:bottom w:val="single" w:color="CCCCCC" w:sz="1"/>
+              <w:right w:val="single" w:color="CCCCCC" w:sz="1"/>
+            </w:tcBorders>
+            <w:tcMar>
+              <w:top w:type="dxa" w:w="60"/>
+              <w:left w:type="dxa" w:w="100"/>
+              <w:bottom w:type="dxa" w:w="60"/>
+              <w:right w:type="dxa" w:w="100"/>
+            </w:tcMar>
+          </w:tcPr>
+          <w:p>
+            <w:r>
+              <w:rPr>
+                <w:rFonts w:ascii="Arial" w:cs="Arial" w:eastAsia="Arial" w:hAnsi="Arial"/>
+                <w:sz w:val="20"/>
+                <w:szCs w:val="20"/>
+              </w:rPr>
+              <w:t xml:space="preserve">红线二: 外部 API 预留</w:t>
+            </w:r>
+          </w:p>
+        </w:tc>
+        <w:tc>
+          <w:tcPr>
+            <w:tcW w:type="dxa" w:w="5526"/>
+            <w:tcBorders>
+              <w:top w:val="single" w:color="CCCCCC" w:sz="1"/>
+              <w:left w:val="single" w:color="CCCCCC" w:sz="1"/>
+              <w:bottom w:val="single" w:color="CCCCCC" w:sz="1"/>
+              <w:right w:val="single" w:color="CCCCCC" w:sz="1"/>
+            </w:tcBorders>
+            <w:tcMar>
+              <w:top w:type="dxa" w:w="60"/>
+              <w:left w:type="dxa" w:w="100"/>
+              <w:bottom w:type="dxa" w:w="60"/>
+              <w:right w:type="dxa" w:w="100"/>
+            </w:tcMar>
+          </w:tcPr>
+          <w:p>
+            <w:r>
+              <w:rPr>
+                <w:rFonts w:ascii="Arial" w:cs="Arial" w:eastAsia="Arial" w:hAnsi="Arial"/>
+                <w:sz w:val="20"/>
+                <w:szCs w:val="20"/>
+              </w:rPr>
+              <w:t xml:space="preserve">✅ 4 adapter + .env.example 补齐</w:t>
+            </w:r>
+          </w:p>
+        </w:tc>
+      </w:tr>
+      <w:tr>
+        <w:tc>
+          <w:tcPr>
+            <w:tcW w:type="dxa" w:w="3500"/>
+            <w:tcBorders>
+              <w:top w:val="single" w:color="CCCCCC" w:sz="1"/>
+              <w:left w:val="single" w:color="CCCCCC" w:sz="1"/>
+              <w:bottom w:val="single" w:color="CCCCCC" w:sz="1"/>
+              <w:right w:val="single" w:color="CCCCCC" w:sz="1"/>
+            </w:tcBorders>
+            <w:tcMar>
+              <w:top w:type="dxa" w:w="60"/>
+              <w:left w:type="dxa" w:w="100"/>
+              <w:bottom w:type="dxa" w:w="60"/>
+              <w:right w:type="dxa" w:w="100"/>
+            </w:tcMar>
+          </w:tcPr>
+          <w:p>
+            <w:r>
+              <w:rPr>
+                <w:rFonts w:ascii="Arial" w:cs="Arial" w:eastAsia="Arial" w:hAnsi="Arial"/>
+                <w:sz w:val="20"/>
+                <w:szCs w:val="20"/>
+              </w:rPr>
+              <w:t xml:space="preserve">红线三: 交互复杂度</w:t>
+            </w:r>
+          </w:p>
+        </w:tc>
+        <w:tc>
+          <w:tcPr>
+            <w:tcW w:type="dxa" w:w="5526"/>
+            <w:tcBorders>
+              <w:top w:val="single" w:color="CCCCCC" w:sz="1"/>
+              <w:left w:val="single" w:color="CCCCCC" w:sz="1"/>
+              <w:bottom w:val="single" w:color="CCCCCC" w:sz="1"/>
+              <w:right w:val="single" w:color="CCCCCC" w:sz="1"/>
+            </w:tcBorders>
+            <w:tcMar>
+              <w:top w:type="dxa" w:w="60"/>
+              <w:left w:type="dxa" w:w="100"/>
+              <w:bottom w:type="dxa" w:w="60"/>
+              <w:right w:type="dxa" w:w="100"/>
+            </w:tcMar>
+          </w:tcPr>
+          <w:p>
+            <w:r>
+              <w:rPr>
+                <w:rFonts w:ascii="Arial" w:cs="Arial" w:eastAsia="Arial" w:hAnsi="Arial"/>
+                <w:sz w:val="20"/>
+                <w:szCs w:val="20"/>
+              </w:rPr>
+              <w:t xml:space="preserve">✅ Drawer 4 Tab / 按钮单一职责</w:t>
+            </w:r>
+          </w:p>
+        </w:tc>
+      </w:tr>
+      <w:tr>
+        <w:tc>
+          <w:tcPr>
+            <w:tcW w:type="dxa" w:w="3500"/>
+            <w:tcBorders>
+              <w:top w:val="single" w:color="CCCCCC" w:sz="1"/>
+              <w:left w:val="single" w:color="CCCCCC" w:sz="1"/>
+              <w:bottom w:val="single" w:color="CCCCCC" w:sz="1"/>
+              <w:right w:val="single" w:color="CCCCCC" w:sz="1"/>
+            </w:tcBorders>
+            <w:tcMar>
+              <w:top w:type="dxa" w:w="60"/>
+              <w:left w:type="dxa" w:w="100"/>
+              <w:bottom w:type="dxa" w:w="60"/>
+              <w:right w:type="dxa" w:w="100"/>
+            </w:tcMar>
+          </w:tcPr>
+          <w:p>
+            <w:r>
+              <w:rPr>
+                <w:rFonts w:ascii="Arial" w:cs="Arial" w:eastAsia="Arial" w:hAnsi="Arial"/>
+                <w:sz w:val="20"/>
+                <w:szCs w:val="20"/>
+              </w:rPr>
               <w:t xml:space="preserve">是否建议进入 Phase 4</w:t>
             </w:r>
           </w:p>
@@ -3277,30 +4702,12 @@
                 <w:sz w:val="20"/>
                 <w:szCs w:val="20"/>
               </w:rPr>
-              <w:t xml:space="preserve">✅ 是 — 候选人与投递链路</w:t>
+              <w:t xml:space="preserve">等待外部审查</w:t>
             </w:r>
           </w:p>
         </w:tc>
       </w:tr>
     </w:tbl>
-    <w:p>
-      <w:pPr>
-        <w:spacing w:before="200"/>
-      </w:pPr>
-      <w:r>
-        <w:rPr>
-          <w:rFonts w:ascii="Arial" w:cs="Arial" w:eastAsia="Arial" w:hAnsi="Arial"/>
-          <w:b/>
-          <w:bCs/>
-          <w:i/>
-          <w:iCs/>
-          <w:color w:val="d97706"/>
-          <w:sz w:val="22"/>
-          <w:szCs w:val="22"/>
-        </w:rPr>
-        <w:t xml:space="preserve">⚠️ 我不会自行进入 Phase 4。等待外部审查。</w:t>
-      </w:r>
-    </w:p>
     <w:sectPr>
       <w:headerReference w:type="default" r:id="rId7"/>
       <w:footerReference w:type="default" r:id="rId8"/>
@@ -3538,8 +4945,26 @@
       </w:pPr>
     </w:lvl>
   </w:abstractNum>
+  <w:abstractNum w:abstractNumId="2" w15:restartNumberingAfterBreak="0">
+    <w:multiLevelType w:val="hybridMultilevel"/>
+    <w:lvl w:ilvl="0" w15:tentative="1">
+      <w:start w:val="1"/>
+      <w:numFmt w:val="bullet"/>
+      <w:lvlText w:val="•"/>
+      <w:lvlJc w:val="left"/>
+      <w:pPr>
+        <w:ind w:left="720" w:hanging="360"/>
+      </w:pPr>
+    </w:lvl>
+  </w:abstractNum>
   <w:num w:numId="1">
     <w:abstractNumId w:val="1"/>
+    <w:lvlOverride w:ilvl="0">
+      <w:startOverride w:val="1"/>
+    </w:lvlOverride>
+  </w:num>
+  <w:num w:numId="2">
+    <w:abstractNumId w:val="2"/>
     <w:lvlOverride w:ilvl="0">
       <w:startOverride w:val="1"/>
     </w:lvlOverride>

</xml_diff>